<commit_message>
feat(resume): update resume documents with new content
- Updated `resume.pdf`, `wilsonchow_resume_v4_full-stack.pdf`, `wilsonchow_resume_v4_frontend.docx`, and `wilsonchow_resume_v4_full-stack.docx` with revised content to reflect recent experiences and skills.
- Ensured consistency and clarity across all updated documents for improved presentation.
</commit_message>
<xml_diff>
--- a/apps/web/src/features/resume/wilsonchow_resume_v4_frontend.docx
+++ b/apps/web/src/features/resume/wilsonchow_resume_v4_frontend.docx
@@ -670,7 +670,7 @@
           <w:color w:val="1A1A1A"/>
           <w:sz w:val="21"/>
         </w:rPr>
-        <w:t xml:space="preserve">Built interactive and multi-step flows with TanStack Query prefetch/hydration and TanStack Form + Zod; locale-aware routing, copy, and date/number formatting on client content sites.</w:t>
+        <w:t xml:space="preserve">Built interactive and multi-step flows with TanStack Query prefetch/hydration, TanStack Form + Zod, and XState; locale-aware routing, copy, and date/number formatting on client content sites.</w:t>
       </w:r>
     </w:p>
     <w:p>
@@ -889,7 +889,7 @@
           <w:color w:val="1A1A1A"/>
           <w:sz w:val="21"/>
         </w:rPr>
-        <w:t xml:space="preserve">React, Next.js, React Native, Expo, TanStack Query, TanStack Form, TanStack Table, Framer Motion, Tailwind CSS, Chakra UI, shadcn/ui, Storybook, Figma, MDX, TipTap, D3</w:t>
+        <w:t xml:space="preserve">React, Next.js, React Native, Expo, TanStack Query, TanStack Form, XState, TanStack Table, Framer Motion, Tailwind CSS, Chakra UI, shadcn/ui, Storybook, Figma, MDX, TipTap, D3</w:t>
       </w:r>
     </w:p>
     <w:p>

</xml_diff>

<commit_message>
Add new resume variant and update routing for improved navigation
- Introduced a new resume variant for "full-stack" and updated the Next.js routing configuration to redirect requests from "/:locale/resume" to "/:locale/resume/full-stack".
- Added new PDF resume files for "full-stack" and "frontend" variants.
- Enhanced robots and sitemap configurations to reflect the new resume structure.
- Updated various components and pages to incorporate the new resume variant, ensuring consistent navigation and accessibility across the application.
- Improved internationalization support by adding translations for the new components section.
</commit_message>
<xml_diff>
--- a/apps/web/src/features/resume/wilsonchow_resume_v4_frontend.docx
+++ b/apps/web/src/features/resume/wilsonchow_resume_v4_frontend.docx
@@ -4,149 +4,96 @@
   <w:body>
     <w:p>
       <w:pPr>
-        <w:spacing w:after="40"/>
+        <w:spacing w:before="0" w:after="40" w:line="240" w:lineRule="auto"/>
         <w:jc w:val="center"/>
       </w:pPr>
       <w:r>
         <w:rPr>
-          <w:rFonts w:ascii="Calibri" w:hAnsi="Calibri" w:eastAsia="Calibri"/>
+          <w:rFonts w:ascii="Calibri" w:hAnsi="Calibri" w:eastAsia="Calibri" w:cs="Calibri"/>
           <w:b/>
           <w:color w:val="1A1A1A"/>
           <w:sz w:val="44"/>
         </w:rPr>
-        <w:t xml:space="preserve">Wilson, Chow Sin Long</w:t>
+        <w:t>Wilson, Chow Sin Long</w:t>
       </w:r>
     </w:p>
     <w:p>
       <w:pPr>
-        <w:spacing w:after="40"/>
+        <w:spacing w:before="0" w:after="40" w:line="240" w:lineRule="auto"/>
         <w:jc w:val="center"/>
       </w:pPr>
       <w:r>
         <w:rPr>
-          <w:rFonts w:ascii="Calibri" w:hAnsi="Calibri" w:eastAsia="Calibri"/>
+          <w:rFonts w:ascii="Calibri" w:hAnsi="Calibri" w:eastAsia="Calibri" w:cs="Calibri"/>
           <w:b w:val="0"/>
           <w:color w:val="4A4A4A"/>
           <w:sz w:val="19"/>
         </w:rPr>
-        <w:t xml:space="preserve">sinlongchow@gmail.com  ·  slchow.com  ·  linkedin.com/in/wilsonslchow  ·  github.com/ocwilsonchow</w:t>
+        <w:t>sinlongchow@gmail.com  ·  slchow.com  ·  linkedin.com/in/wilsonslchow  ·  github.com/ocwilsonchow</w:t>
       </w:r>
     </w:p>
     <w:p>
       <w:pPr>
-        <w:spacing w:after="40"/>
+        <w:spacing w:before="0" w:after="40" w:line="240" w:lineRule="auto"/>
         <w:jc w:val="center"/>
       </w:pPr>
       <w:r>
         <w:rPr>
-          <w:rFonts w:ascii="Calibri" w:hAnsi="Calibri" w:eastAsia="Calibri"/>
+          <w:rFonts w:ascii="Calibri" w:hAnsi="Calibri" w:eastAsia="Calibri" w:cs="Calibri"/>
           <w:b/>
           <w:color w:val="2C2C2C"/>
           <w:sz w:val="20"/>
         </w:rPr>
-        <w:t xml:space="preserve">Frontend Software Engineer  ·  AWS Solutions Architect Associate</w:t>
+        <w:t>Senior Product Frontend Engineer  ·  AWS Solutions Architect Associate</w:t>
       </w:r>
     </w:p>
     <w:p>
       <w:pPr>
-        <w:spacing w:before="200" w:after="80"/>
+        <w:spacing w:before="200" w:after="80" w:line="240" w:lineRule="auto"/>
         <w:pBdr>
           <w:bottom w:val="single" w:sz="12" w:space="1" w:color="2C2C2C"/>
         </w:pBdr>
       </w:pPr>
       <w:r>
         <w:rPr>
-          <w:rFonts w:ascii="Calibri" w:hAnsi="Calibri" w:eastAsia="Calibri"/>
+          <w:rFonts w:ascii="Calibri" w:hAnsi="Calibri" w:eastAsia="Calibri" w:cs="Calibri"/>
           <w:b/>
           <w:color w:val="2C2C2C"/>
           <w:sz w:val="22"/>
         </w:rPr>
-        <w:t xml:space="preserve">SUMMARY</w:t>
+        <w:t>SUMMARY</w:t>
       </w:r>
     </w:p>
     <w:p>
       <w:pPr>
-        <w:spacing w:after="60" w:before="0"/>
+        <w:spacing w:before="0" w:after="60" w:line="240" w:lineRule="auto"/>
       </w:pPr>
       <w:r>
         <w:rPr>
-          <w:rFonts w:ascii="Calibri" w:hAnsi="Calibri" w:eastAsia="Calibri"/>
+          <w:rFonts w:ascii="Calibri" w:hAnsi="Calibri" w:eastAsia="Calibri" w:cs="Calibri"/>
           <w:b w:val="0"/>
+          <w:i w:val="0"/>
           <w:color w:val="1A1A1A"/>
           <w:sz w:val="21"/>
         </w:rPr>
-        <w:t xml:space="preserve">Frontend software engineer with 5 years shipping TypeScript React / React Native — Figma through App Store / Play Store, plus the typed APIs and mobile auth those apps run on. Built </w:t>
-      </w:r>
-      <w:r>
-        <w:rPr>
-          <w:rFonts w:ascii="Calibri" w:hAnsi="Calibri" w:eastAsia="Calibri"/>
-          <w:b/>
-          <w:color w:val="1A1A1A"/>
-          <w:sz w:val="21"/>
-        </w:rPr>
-        <w:t xml:space="preserve">15+</w:t>
-      </w:r>
-      <w:r>
-        <w:rPr>
-          <w:rFonts w:ascii="Calibri" w:hAnsi="Calibri" w:eastAsia="Calibri"/>
-          <w:b w:val="0"/>
-          <w:color w:val="1A1A1A"/>
-          <w:sz w:val="21"/>
-        </w:rPr>
-        <w:t xml:space="preserve"> apps from scratch and over multiple years. Cut load times by up to </w:t>
-      </w:r>
-      <w:r>
-        <w:rPr>
-          <w:rFonts w:ascii="Calibri" w:hAnsi="Calibri" w:eastAsia="Calibri"/>
-          <w:b/>
-          <w:color w:val="1A1A1A"/>
-          <w:sz w:val="21"/>
-        </w:rPr>
-        <w:t xml:space="preserve">80%</w:t>
-      </w:r>
-      <w:r>
-        <w:rPr>
-          <w:rFonts w:ascii="Calibri" w:hAnsi="Calibri" w:eastAsia="Calibri"/>
-          <w:b w:val="0"/>
-          <w:color w:val="1A1A1A"/>
-          <w:sz w:val="21"/>
-        </w:rPr>
-        <w:t xml:space="preserve"> and search latency by </w:t>
-      </w:r>
-      <w:r>
-        <w:rPr>
-          <w:rFonts w:ascii="Calibri" w:hAnsi="Calibri" w:eastAsia="Calibri"/>
-          <w:b/>
-          <w:color w:val="1A1A1A"/>
-          <w:sz w:val="21"/>
-        </w:rPr>
-        <w:t xml:space="preserve">90%</w:t>
-      </w:r>
-      <w:r>
-        <w:rPr>
-          <w:rFonts w:ascii="Calibri" w:hAnsi="Calibri" w:eastAsia="Calibri"/>
-          <w:b w:val="0"/>
-          <w:color w:val="1A1A1A"/>
-          <w:sz w:val="21"/>
-        </w:rPr>
-        <w:t xml:space="preserve">. Currently leading the UI for a multi-channel Generative AI agent platform: chat, tool-invocation, and file-mention on durable agent runs. AWS Solutions Architect Associate.</w:t>
+        <w:t>Senior product frontend engineer with 5 years of experience owning React and React Native product flows — from Figma and design systems through frontend development, tRPC APIs, and release. Pays close attention to UI and UX details, not only whether the flow ships. Shipped 15+ production apps.</w:t>
       </w:r>
     </w:p>
     <w:p>
       <w:pPr>
-        <w:spacing w:before="200" w:after="80"/>
+        <w:spacing w:before="200" w:after="80" w:line="240" w:lineRule="auto"/>
         <w:pBdr>
           <w:bottom w:val="single" w:sz="12" w:space="1" w:color="2C2C2C"/>
         </w:pBdr>
       </w:pPr>
       <w:r>
         <w:rPr>
-          <w:rFonts w:ascii="Calibri" w:hAnsi="Calibri" w:eastAsia="Calibri"/>
+          <w:rFonts w:ascii="Calibri" w:hAnsi="Calibri" w:eastAsia="Calibri" w:cs="Calibri"/>
           <w:b/>
           <w:color w:val="2C2C2C"/>
           <w:sz w:val="22"/>
         </w:rPr>
-        <w:t xml:space="preserve">EXPERIENCE</w:t>
+        <w:t>EXPERIENCE</w:t>
       </w:r>
     </w:p>
     <w:p>
@@ -154,259 +101,41 @@
         <w:tabs>
           <w:tab w:pos="10224" w:val="right"/>
         </w:tabs>
-        <w:spacing w:before="160" w:after="20"/>
+        <w:spacing w:before="160" w:after="20" w:line="240" w:lineRule="auto"/>
       </w:pPr>
       <w:r>
         <w:rPr>
-          <w:rFonts w:ascii="Calibri" w:hAnsi="Calibri" w:eastAsia="Calibri"/>
+          <w:rFonts w:ascii="Calibri" w:hAnsi="Calibri" w:eastAsia="Calibri" w:cs="Calibri"/>
           <w:b/>
           <w:color w:val="1A1A1A"/>
           <w:sz w:val="22"/>
         </w:rPr>
-        <w:t xml:space="preserve">Software Developer, Vioo Company Limited</w:t>
+        <w:t>Frontend Developer, Vioo Company Limited</w:t>
       </w:r>
       <w:r>
         <w:rPr>
-          <w:rFonts w:ascii="Calibri" w:hAnsi="Calibri" w:eastAsia="Calibri"/>
+          <w:rFonts w:ascii="Calibri" w:hAnsi="Calibri" w:eastAsia="Calibri" w:cs="Calibri"/>
           <w:b w:val="0"/>
           <w:color w:val="4A4A4A"/>
           <w:sz w:val="20"/>
         </w:rPr>
         <w:tab/>
-        <w:t xml:space="preserve">May 2022 – Present</w:t>
+        <w:t>May 2022 – Present</w:t>
       </w:r>
     </w:p>
     <w:p>
       <w:pPr>
-        <w:spacing w:after="60" w:before="0"/>
+        <w:spacing w:before="0" w:after="60" w:line="240" w:lineRule="auto"/>
       </w:pPr>
       <w:r>
         <w:rPr>
-          <w:rFonts w:ascii="Calibri" w:hAnsi="Calibri" w:eastAsia="Calibri"/>
+          <w:rFonts w:ascii="Calibri" w:hAnsi="Calibri" w:eastAsia="Calibri" w:cs="Calibri"/>
           <w:b w:val="0"/>
+          <w:i w:val="0"/>
           <w:color w:val="4A4A4A"/>
           <w:sz w:val="20"/>
         </w:rPr>
-        <w:t xml:space="preserve">Primary engineer for concurrent client products — Figma through production UI and the APIs behind it.</w:t>
-      </w:r>
-    </w:p>
-    <w:p>
-      <w:pPr>
-        <w:pStyle w:val="ListBullet"/>
-        <w:spacing w:after="30" w:before="0"/>
-        <w:ind w:left="288"/>
-      </w:pPr>
-      <w:r>
-        <w:rPr>
-          <w:rFonts w:ascii="Calibri" w:hAnsi="Calibri" w:eastAsia="Calibri"/>
-          <w:b w:val="0"/>
-          <w:color w:val="1A1A1A"/>
-          <w:sz w:val="21"/>
-        </w:rPr>
-        <w:t xml:space="preserve">Shipped and maintained </w:t>
-      </w:r>
-      <w:r>
-        <w:rPr>
-          <w:rFonts w:ascii="Calibri" w:hAnsi="Calibri" w:eastAsia="Calibri"/>
-          <w:b/>
-          <w:color w:val="1A1A1A"/>
-          <w:sz w:val="21"/>
-        </w:rPr>
-        <w:t xml:space="preserve">15+</w:t>
-      </w:r>
-      <w:r>
-        <w:rPr>
-          <w:rFonts w:ascii="Calibri" w:hAnsi="Calibri" w:eastAsia="Calibri"/>
-          <w:b w:val="0"/>
-          <w:color w:val="1A1A1A"/>
-          <w:sz w:val="21"/>
-        </w:rPr>
-        <w:t xml:space="preserve"> production React / React Native apps from scratch and over multiple years, including high-fidelity Figma design, shared design systems reused across client work, and App Store / Play Store releases.</w:t>
-      </w:r>
-    </w:p>
-    <w:p>
-      <w:pPr>
-        <w:pStyle w:val="ListBullet"/>
-        <w:spacing w:after="30" w:before="0"/>
-        <w:ind w:left="288"/>
-      </w:pPr>
-      <w:r>
-        <w:rPr>
-          <w:rFonts w:ascii="Calibri" w:hAnsi="Calibri" w:eastAsia="Calibri"/>
-          <w:b w:val="0"/>
-          <w:color w:val="1A1A1A"/>
-          <w:sz w:val="21"/>
-        </w:rPr>
-        <w:t xml:space="preserve">Replaced a WordPress stack with an in-house headless CMS (Strapi / Sanity) and search (Meilisearch / Algolia) in a Turborepo, deployed with SST, so publishing continued through the transition: cut load time by </w:t>
-      </w:r>
-      <w:r>
-        <w:rPr>
-          <w:rFonts w:ascii="Calibri" w:hAnsi="Calibri" w:eastAsia="Calibri"/>
-          <w:b/>
-          <w:color w:val="1A1A1A"/>
-          <w:sz w:val="21"/>
-        </w:rPr>
-        <w:t xml:space="preserve">80%</w:t>
-      </w:r>
-      <w:r>
-        <w:rPr>
-          <w:rFonts w:ascii="Calibri" w:hAnsi="Calibri" w:eastAsia="Calibri"/>
-          <w:b w:val="0"/>
-          <w:color w:val="1A1A1A"/>
-          <w:sz w:val="21"/>
-        </w:rPr>
-        <w:t xml:space="preserve">, search latency by </w:t>
-      </w:r>
-      <w:r>
-        <w:rPr>
-          <w:rFonts w:ascii="Calibri" w:hAnsi="Calibri" w:eastAsia="Calibri"/>
-          <w:b/>
-          <w:color w:val="1A1A1A"/>
-          <w:sz w:val="21"/>
-        </w:rPr>
-        <w:t xml:space="preserve">90%</w:t>
-      </w:r>
-      <w:r>
-        <w:rPr>
-          <w:rFonts w:ascii="Calibri" w:hAnsi="Calibri" w:eastAsia="Calibri"/>
-          <w:b w:val="0"/>
-          <w:color w:val="1A1A1A"/>
-          <w:sz w:val="21"/>
-        </w:rPr>
-        <w:t xml:space="preserve">, and hit PageSpeed Insights </w:t>
-      </w:r>
-      <w:r>
-        <w:rPr>
-          <w:rFonts w:ascii="Calibri" w:hAnsi="Calibri" w:eastAsia="Calibri"/>
-          <w:b/>
-          <w:color w:val="1A1A1A"/>
-          <w:sz w:val="21"/>
-        </w:rPr>
-        <w:t xml:space="preserve">&gt;90</w:t>
-      </w:r>
-      <w:r>
-        <w:rPr>
-          <w:rFonts w:ascii="Calibri" w:hAnsi="Calibri" w:eastAsia="Calibri"/>
-          <w:b w:val="0"/>
-          <w:color w:val="1A1A1A"/>
-          <w:sz w:val="21"/>
-        </w:rPr>
-        <w:t xml:space="preserve">. Node.js APIs on ECS Fargate; other workloads on Lambda / API Gateway.</w:t>
-      </w:r>
-    </w:p>
-    <w:p>
-      <w:pPr>
-        <w:pStyle w:val="ListBullet"/>
-        <w:spacing w:after="30" w:before="0"/>
-        <w:ind w:left="288"/>
-      </w:pPr>
-      <w:r>
-        <w:rPr>
-          <w:rFonts w:ascii="Calibri" w:hAnsi="Calibri" w:eastAsia="Calibri"/>
-          <w:b w:val="0"/>
-          <w:color w:val="1A1A1A"/>
-          <w:sz w:val="21"/>
-        </w:rPr>
-        <w:t xml:space="preserve">Established shared Radix / Tailwind component and hook libraries with Storybook, Fumadocs, and MDX docs, reused across client apps. Led frontend reviews; Vitest / Cypress on critical flows.</w:t>
-      </w:r>
-    </w:p>
-    <w:p>
-      <w:pPr>
-        <w:pStyle w:val="ListBullet"/>
-        <w:spacing w:after="30" w:before="0"/>
-        <w:ind w:left="288"/>
-      </w:pPr>
-      <w:r>
-        <w:rPr>
-          <w:rFonts w:ascii="Calibri" w:hAnsi="Calibri" w:eastAsia="Calibri"/>
-          <w:b w:val="0"/>
-          <w:color w:val="1A1A1A"/>
-          <w:sz w:val="21"/>
-        </w:rPr>
-        <w:t xml:space="preserve">Built Next.js apps with SSR / ISR, aggregating Shopify GraphQL, CMS, and search APIs with caching. Independently debugged Node runtime issues and production bottlenecks across UI and API (Lighthouse, Sentry).</w:t>
-      </w:r>
-    </w:p>
-    <w:p>
-      <w:pPr>
-        <w:pStyle w:val="ListBullet"/>
-        <w:spacing w:after="30" w:before="0"/>
-        <w:ind w:left="288"/>
-      </w:pPr>
-      <w:r>
-        <w:rPr>
-          <w:rFonts w:ascii="Calibri" w:hAnsi="Calibri" w:eastAsia="Calibri"/>
-          <w:b w:val="0"/>
-          <w:color w:val="1A1A1A"/>
-          <w:sz w:val="21"/>
-        </w:rPr>
-        <w:t xml:space="preserve">Built auth on a typed API: Better Auth sessions and org membership, OAuth 2.0 / OIDC, JWT / session lifecycle, and RBAC. Sessions live in HttpOnly / Secure / SameSite cookies, not localStorage tokens.</w:t>
-      </w:r>
-    </w:p>
-    <w:p>
-      <w:pPr>
-        <w:pStyle w:val="ListBullet"/>
-        <w:spacing w:after="30" w:before="0"/>
-        <w:ind w:left="288"/>
-      </w:pPr>
-      <w:r>
-        <w:rPr>
-          <w:rFonts w:ascii="Calibri" w:hAnsi="Calibri" w:eastAsia="Calibri"/>
-          <w:b w:val="0"/>
-          <w:color w:val="1A1A1A"/>
-          <w:sz w:val="21"/>
-        </w:rPr>
-        <w:t xml:space="preserve">Built typed Node.js APIs with Hono, Drizzle / Prisma, OpenAPI, and tRPC. GitHub Actions + SST for CI/CD — lint, typecheck, tests, and build before deploy — cutting deploy time by </w:t>
-      </w:r>
-      <w:r>
-        <w:rPr>
-          <w:rFonts w:ascii="Calibri" w:hAnsi="Calibri" w:eastAsia="Calibri"/>
-          <w:b/>
-          <w:color w:val="1A1A1A"/>
-          <w:sz w:val="21"/>
-        </w:rPr>
-        <w:t xml:space="preserve">50%+</w:t>
-      </w:r>
-      <w:r>
-        <w:rPr>
-          <w:rFonts w:ascii="Calibri" w:hAnsi="Calibri" w:eastAsia="Calibri"/>
-          <w:b w:val="0"/>
-          <w:color w:val="1A1A1A"/>
-          <w:sz w:val="21"/>
-        </w:rPr>
-        <w:t xml:space="preserve">.</w:t>
-      </w:r>
-    </w:p>
-    <w:p>
-      <w:pPr>
-        <w:pStyle w:val="ListBullet"/>
-        <w:spacing w:after="30" w:before="0"/>
-        <w:ind w:left="288"/>
-      </w:pPr>
-      <w:r>
-        <w:rPr>
-          <w:rFonts w:ascii="Calibri" w:hAnsi="Calibri" w:eastAsia="Calibri"/>
-          <w:b w:val="0"/>
-          <w:color w:val="1A1A1A"/>
-          <w:sz w:val="21"/>
-        </w:rPr>
-        <w:t xml:space="preserve">Mentored summer interns and junior developers through pairing, code reviews, and shipping production work.</w:t>
-      </w:r>
-    </w:p>
-    <w:p>
-      <w:pPr>
-        <w:spacing w:before="200" w:after="80"/>
-        <w:pBdr>
-          <w:bottom w:val="single" w:sz="12" w:space="1" w:color="2C2C2C"/>
-        </w:pBdr>
-      </w:pPr>
-      <w:r>
-        <w:rPr>
-          <w:rFonts w:ascii="Calibri" w:hAnsi="Calibri" w:eastAsia="Calibri"/>
-          <w:b/>
-          <w:color w:val="2C2C2C"/>
-          <w:sz w:val="22"/>
-        </w:rPr>
-        <w:t xml:space="preserve">SELECTED PROJECTS</w:t>
+        <w:t>Primary frontend engineer for concurrent client products, scoping UX with designers and stakeholders, turning Figma into tokenized, composable UI, and owning each product flow through release.</w:t>
       </w:r>
     </w:p>
     <w:p>
@@ -414,104 +143,138 @@
         <w:tabs>
           <w:tab w:pos="10224" w:val="right"/>
         </w:tabs>
-        <w:spacing w:before="160" w:after="20"/>
+        <w:spacing w:before="160" w:after="20" w:line="240" w:lineRule="auto"/>
       </w:pPr>
       <w:r>
         <w:rPr>
-          <w:rFonts w:ascii="Calibri" w:hAnsi="Calibri" w:eastAsia="Calibri"/>
+          <w:rFonts w:ascii="Calibri" w:hAnsi="Calibri" w:eastAsia="Calibri" w:cs="Calibri"/>
           <w:b/>
           <w:color w:val="1A1A1A"/>
           <w:sz w:val="22"/>
         </w:rPr>
-        <w:t xml:space="preserve">Multi-Channel Agentic Platform</w:t>
+        <w:t>Healthcare AI Agent</w:t>
       </w:r>
       <w:r>
         <w:rPr>
-          <w:rFonts w:ascii="Calibri" w:hAnsi="Calibri" w:eastAsia="Calibri"/>
+          <w:rFonts w:ascii="Calibri" w:hAnsi="Calibri" w:eastAsia="Calibri" w:cs="Calibri"/>
           <w:b w:val="0"/>
           <w:color w:val="4A4A4A"/>
           <w:sz w:val="20"/>
         </w:rPr>
         <w:tab/>
-        <w:t xml:space="preserve">Apr 2026 – Present</w:t>
-      </w:r>
-    </w:p>
-    <w:p>
-      <w:pPr>
-        <w:spacing w:after="60" w:before="0"/>
-      </w:pPr>
-      <w:r>
-        <w:rPr>
-          <w:rFonts w:ascii="Calibri" w:hAnsi="Calibri" w:eastAsia="Calibri"/>
-          <w:b w:val="0"/>
-          <w:color w:val="4A4A4A"/>
-          <w:sz w:val="20"/>
-        </w:rPr>
-        <w:t xml:space="preserve">Client-facing agent UI (web + Discord) for durable, multi-channel assistants.</w:t>
+        <w:t>2025 – 2026</w:t>
       </w:r>
     </w:p>
     <w:p>
       <w:pPr>
         <w:pStyle w:val="ListBullet"/>
-        <w:spacing w:after="30" w:before="0"/>
+        <w:spacing w:before="0" w:after="30" w:line="240" w:lineRule="auto"/>
         <w:ind w:left="288"/>
       </w:pPr>
       <w:r>
         <w:rPr>
-          <w:rFonts w:ascii="Calibri" w:hAnsi="Calibri" w:eastAsia="Calibri"/>
+          <w:rFonts w:ascii="Calibri" w:hAnsi="Calibri" w:eastAsia="Calibri" w:cs="Calibri"/>
           <w:b w:val="0"/>
           <w:color w:val="1A1A1A"/>
           <w:sz w:val="21"/>
         </w:rPr>
-        <w:t xml:space="preserve">Each agent run is a durable stream: clients disconnect, reconnect, and resume mid-run without losing progress.</w:t>
+        <w:t>Designed the chat and admin UX in Figma and owned the client-facing flows — document upload, in-chat questionnaire, product and cart actions.</w:t>
       </w:r>
     </w:p>
     <w:p>
       <w:pPr>
         <w:pStyle w:val="ListBullet"/>
-        <w:spacing w:after="30" w:before="0"/>
+        <w:spacing w:before="0" w:after="30" w:line="240" w:lineRule="auto"/>
         <w:ind w:left="288"/>
       </w:pPr>
       <w:r>
         <w:rPr>
-          <w:rFonts w:ascii="Calibri" w:hAnsi="Calibri" w:eastAsia="Calibri"/>
+          <w:rFonts w:ascii="Calibri" w:hAnsi="Calibri" w:eastAsia="Calibri" w:cs="Calibri"/>
           <w:b w:val="0"/>
           <w:color w:val="1A1A1A"/>
           <w:sz w:val="21"/>
         </w:rPr>
-        <w:t xml:space="preserve">Shipped chat, tool-invocation, and multi-step client flows, plus a TipTap @mention file-tagging component for attaching workspace files into prompts.</w:t>
+        <w:t>Hardened Next.js admin and client apps with Better Auth, HttpOnly cookies, CORS, and RBAC.</w:t>
       </w:r>
     </w:p>
     <w:p>
       <w:pPr>
         <w:pStyle w:val="ListBullet"/>
-        <w:spacing w:after="30" w:before="0"/>
+        <w:spacing w:before="0" w:after="30" w:line="240" w:lineRule="auto"/>
         <w:ind w:left="288"/>
       </w:pPr>
       <w:r>
         <w:rPr>
-          <w:rFonts w:ascii="Calibri" w:hAnsi="Calibri" w:eastAsia="Calibri"/>
+          <w:rFonts w:ascii="Calibri" w:hAnsi="Calibri" w:eastAsia="Calibri" w:cs="Calibri"/>
           <w:b w:val="0"/>
           <w:color w:val="1A1A1A"/>
           <w:sz w:val="21"/>
         </w:rPr>
-        <w:t xml:space="preserve">Visible run status, retries, and resume in the UI.</w:t>
+        <w:t>Streamed LangGraph agent replies into the chat with the AI SDK over tRPC, rendering tool calls as product cards, cart actions, and questionnaires instead of plain text.</w:t>
       </w:r>
     </w:p>
     <w:p>
       <w:pPr>
         <w:pStyle w:val="ListBullet"/>
-        <w:spacing w:after="30" w:before="0"/>
+        <w:spacing w:before="0" w:after="30" w:line="240" w:lineRule="auto"/>
         <w:ind w:left="288"/>
       </w:pPr>
       <w:r>
         <w:rPr>
-          <w:rFonts w:ascii="Calibri" w:hAnsi="Calibri" w:eastAsia="Calibri"/>
+          <w:rFonts w:ascii="Calibri" w:hAnsi="Calibri" w:eastAsia="Calibri" w:cs="Calibri"/>
           <w:b w:val="0"/>
           <w:color w:val="1A1A1A"/>
           <w:sz w:val="21"/>
         </w:rPr>
-        <w:t xml:space="preserve">Owned the client contract for the SST / ECS Fargate API.</w:t>
+        <w:t>Built an admin form builder with conditional logic and ran those questionnaires in-thread, so product recommendations and cart actions never left the conversation.</w:t>
+      </w:r>
+    </w:p>
+    <w:p>
+      <w:pPr>
+        <w:pStyle w:val="ListBullet"/>
+        <w:spacing w:before="0" w:after="30" w:line="240" w:lineRule="auto"/>
+        <w:ind w:left="288"/>
+      </w:pPr>
+      <w:r>
+        <w:rPr>
+          <w:rFonts w:ascii="Calibri" w:hAnsi="Calibri" w:eastAsia="Calibri" w:cs="Calibri"/>
+          <w:b w:val="0"/>
+          <w:color w:val="1A1A1A"/>
+          <w:sz w:val="21"/>
+        </w:rPr>
+        <w:t>Optimized expensive components with memoization and useTransition for heavy UI updates.</w:t>
+      </w:r>
+    </w:p>
+    <w:p>
+      <w:pPr>
+        <w:pStyle w:val="ListBullet"/>
+        <w:spacing w:before="0" w:after="30" w:line="240" w:lineRule="auto"/>
+        <w:ind w:left="288"/>
+      </w:pPr>
+      <w:r>
+        <w:rPr>
+          <w:rFonts w:ascii="Calibri" w:hAnsi="Calibri" w:eastAsia="Calibri" w:cs="Calibri"/>
+          <w:b w:val="0"/>
+          <w:color w:val="1A1A1A"/>
+          <w:sz w:val="21"/>
+        </w:rPr>
+        <w:t>Used TanStack Query with server prefetch and client-side rehydration for data lists, and TanStack Table with pagination, filters, and sorting; stored table state in URL search parameters so lists stay shareable and bookmarkable.</w:t>
+      </w:r>
+    </w:p>
+    <w:p>
+      <w:pPr>
+        <w:pStyle w:val="ListBullet"/>
+        <w:spacing w:before="0" w:after="30" w:line="240" w:lineRule="auto"/>
+        <w:ind w:left="288"/>
+      </w:pPr>
+      <w:r>
+        <w:rPr>
+          <w:rFonts w:ascii="Calibri" w:hAnsi="Calibri" w:eastAsia="Calibri" w:cs="Calibri"/>
+          <w:b w:val="0"/>
+          <w:color w:val="1A1A1A"/>
+          <w:sz w:val="21"/>
+        </w:rPr>
+        <w:t>Modeled multi-step health questionnaires with XState and React Hook Form / Zod.</w:t>
       </w:r>
     </w:p>
     <w:p>
@@ -519,158 +282,105 @@
         <w:tabs>
           <w:tab w:pos="10224" w:val="right"/>
         </w:tabs>
-        <w:spacing w:before="160" w:after="20"/>
+        <w:spacing w:before="160" w:after="20" w:line="240" w:lineRule="auto"/>
       </w:pPr>
       <w:r>
         <w:rPr>
-          <w:rFonts w:ascii="Calibri" w:hAnsi="Calibri" w:eastAsia="Calibri"/>
+          <w:rFonts w:ascii="Calibri" w:hAnsi="Calibri" w:eastAsia="Calibri" w:cs="Calibri"/>
           <w:b/>
           <w:color w:val="1A1A1A"/>
           <w:sz w:val="22"/>
         </w:rPr>
-        <w:t xml:space="preserve">High-Performance Marketing Site</w:t>
+        <w:t>High-Performance Editorial Platform</w:t>
       </w:r>
       <w:r>
         <w:rPr>
-          <w:rFonts w:ascii="Calibri" w:hAnsi="Calibri" w:eastAsia="Calibri"/>
+          <w:rFonts w:ascii="Calibri" w:hAnsi="Calibri" w:eastAsia="Calibri" w:cs="Calibri"/>
           <w:b w:val="0"/>
           <w:color w:val="4A4A4A"/>
           <w:sz w:val="20"/>
         </w:rPr>
         <w:tab/>
-        <w:t xml:space="preserve">Nov 2025</w:t>
+        <w:t>2025</w:t>
       </w:r>
     </w:p>
     <w:p>
       <w:pPr>
-        <w:spacing w:after="60" w:before="0"/>
+        <w:spacing w:before="0" w:after="60" w:line="240" w:lineRule="auto"/>
       </w:pPr>
       <w:r>
         <w:rPr>
-          <w:rFonts w:ascii="Calibri" w:hAnsi="Calibri" w:eastAsia="Calibri"/>
+          <w:rFonts w:ascii="Calibri" w:hAnsi="Calibri" w:eastAsia="Calibri" w:cs="Calibri"/>
           <w:b w:val="0"/>
+          <w:i w:val="0"/>
           <w:color w:val="4A4A4A"/>
           <w:sz w:val="20"/>
         </w:rPr>
-        <w:t xml:space="preserve">Lead frontend for a content + search marketing site — performance, CMS-backed pages, and publish UX.</w:t>
+        <w:t>Led frontend development for a content and search editorial platform built with Strapi CMS, Meilisearch, and Next.js.</w:t>
       </w:r>
     </w:p>
     <w:p>
       <w:pPr>
         <w:pStyle w:val="ListBullet"/>
-        <w:spacing w:after="30" w:before="0"/>
+        <w:spacing w:before="0" w:after="30" w:line="240" w:lineRule="auto"/>
         <w:ind w:left="288"/>
       </w:pPr>
       <w:r>
         <w:rPr>
-          <w:rFonts w:ascii="Calibri" w:hAnsi="Calibri" w:eastAsia="Calibri"/>
+          <w:rFonts w:ascii="Calibri" w:hAnsi="Calibri" w:eastAsia="Calibri" w:cs="Calibri"/>
           <w:b w:val="0"/>
           <w:color w:val="1A1A1A"/>
           <w:sz w:val="21"/>
         </w:rPr>
-        <w:t xml:space="preserve">Next.js + Strapi + Meilisearch with </w:t>
-      </w:r>
-      <w:r>
-        <w:rPr>
-          <w:rFonts w:ascii="Calibri" w:hAnsi="Calibri" w:eastAsia="Calibri"/>
-          <w:b/>
-          <w:color w:val="1A1A1A"/>
-          <w:sz w:val="21"/>
-        </w:rPr>
-        <w:t xml:space="preserve">LCP &lt; 0.5s</w:t>
-      </w:r>
-      <w:r>
-        <w:rPr>
-          <w:rFonts w:ascii="Calibri" w:hAnsi="Calibri" w:eastAsia="Calibri"/>
-          <w:b w:val="0"/>
-          <w:color w:val="1A1A1A"/>
-          <w:sz w:val="21"/>
-        </w:rPr>
-        <w:t xml:space="preserve">, </w:t>
-      </w:r>
-      <w:r>
-        <w:rPr>
-          <w:rFonts w:ascii="Calibri" w:hAnsi="Calibri" w:eastAsia="Calibri"/>
-          <w:b/>
-          <w:color w:val="1A1A1A"/>
-          <w:sz w:val="21"/>
-        </w:rPr>
-        <w:t xml:space="preserve">CLS &lt; 0.1</w:t>
-      </w:r>
-      <w:r>
-        <w:rPr>
-          <w:rFonts w:ascii="Calibri" w:hAnsi="Calibri" w:eastAsia="Calibri"/>
-          <w:b w:val="0"/>
-          <w:color w:val="1A1A1A"/>
-          <w:sz w:val="21"/>
-        </w:rPr>
-        <w:t xml:space="preserve">, and PageSpeed Insights </w:t>
-      </w:r>
-      <w:r>
-        <w:rPr>
-          <w:rFonts w:ascii="Calibri" w:hAnsi="Calibri" w:eastAsia="Calibri"/>
-          <w:b/>
-          <w:color w:val="1A1A1A"/>
-          <w:sz w:val="21"/>
-        </w:rPr>
-        <w:t xml:space="preserve">&gt;90</w:t>
-      </w:r>
-      <w:r>
-        <w:rPr>
-          <w:rFonts w:ascii="Calibri" w:hAnsi="Calibri" w:eastAsia="Calibri"/>
-          <w:b w:val="0"/>
-          <w:color w:val="1A1A1A"/>
-          <w:sz w:val="21"/>
-        </w:rPr>
-        <w:t xml:space="preserve">.</w:t>
+        <w:t>Latest 100 articles statically rendered at build time, leaving the rest incrementally rendered on demand. Strapi GraphQL queries tagged properly with Next.js cache tags; revalidated through webhook triggered by content update events.</w:t>
       </w:r>
     </w:p>
     <w:p>
       <w:pPr>
         <w:pStyle w:val="ListBullet"/>
-        <w:spacing w:after="30" w:before="0"/>
+        <w:spacing w:before="0" w:after="30" w:line="240" w:lineRule="auto"/>
         <w:ind w:left="288"/>
       </w:pPr>
       <w:r>
         <w:rPr>
-          <w:rFonts w:ascii="Calibri" w:hAnsi="Calibri" w:eastAsia="Calibri"/>
+          <w:rFonts w:ascii="Calibri" w:hAnsi="Calibri" w:eastAsia="Calibri" w:cs="Calibri"/>
           <w:b w:val="0"/>
           <w:color w:val="1A1A1A"/>
           <w:sz w:val="21"/>
         </w:rPr>
-        <w:t xml:space="preserve">Chose hybrid ISR over full SSG or on-demand-only: main pages and the latest 100 articles at build; the rest on demand; Strapi webhook tag revalidation so publishes go live without a full rebuild.</w:t>
+        <w:t>Shipped instant search feature using Meilisearch with full-text search and fuzzy matching; result hits in &lt; 50ms.</w:t>
       </w:r>
     </w:p>
     <w:p>
       <w:pPr>
         <w:pStyle w:val="ListBullet"/>
-        <w:spacing w:after="30" w:before="0"/>
+        <w:spacing w:before="0" w:after="30" w:line="240" w:lineRule="auto"/>
         <w:ind w:left="288"/>
       </w:pPr>
       <w:r>
         <w:rPr>
-          <w:rFonts w:ascii="Calibri" w:hAnsi="Calibri" w:eastAsia="Calibri"/>
+          <w:rFonts w:ascii="Calibri" w:hAnsi="Calibri" w:eastAsia="Calibri" w:cs="Calibri"/>
           <w:b w:val="0"/>
           <w:color w:val="1A1A1A"/>
           <w:sz w:val="21"/>
         </w:rPr>
-        <w:t xml:space="preserve">Accessibility and SEO as ship criteria: semantic structure, keyboard-safe nav/forms, Lighthouse + axe; metadata/OG, canonicals, sitemap, robots.txt, and Article JSON-LD from CMS.</w:t>
+        <w:t>PageSpeed Insights average scores &gt;90; Reserved image space to prevent layout shifts and used caching and image optimization to reduce LCP: FCP &lt; 0.3s, LCP &lt; 0.5s, CLS &lt; 0.001.</w:t>
       </w:r>
     </w:p>
     <w:p>
       <w:pPr>
         <w:pStyle w:val="ListBullet"/>
-        <w:spacing w:after="30" w:before="0"/>
+        <w:spacing w:before="0" w:after="30" w:line="240" w:lineRule="auto"/>
         <w:ind w:left="288"/>
       </w:pPr>
       <w:r>
         <w:rPr>
-          <w:rFonts w:ascii="Calibri" w:hAnsi="Calibri" w:eastAsia="Calibri"/>
+          <w:rFonts w:ascii="Calibri" w:hAnsi="Calibri" w:eastAsia="Calibri" w:cs="Calibri"/>
           <w:b w:val="0"/>
           <w:color w:val="1A1A1A"/>
           <w:sz w:val="21"/>
         </w:rPr>
-        <w:t xml:space="preserve">Built interactive and multi-step flows with TanStack Query prefetch/hydration, TanStack Form + Zod, and XState; locale-aware routing, copy, and date/number formatting on client content sites.</w:t>
+        <w:t>Treated keyboard-accessible navigation, accessible form-error handling, semantic structure, and Lighthouse / axe checks as release requirements rather than post-launch fixes.</w:t>
       </w:r>
     </w:p>
     <w:p>
@@ -678,204 +388,398 @@
         <w:tabs>
           <w:tab w:pos="10224" w:val="right"/>
         </w:tabs>
-        <w:spacing w:before="160" w:after="20"/>
+        <w:spacing w:before="160" w:after="20" w:line="240" w:lineRule="auto"/>
       </w:pPr>
       <w:r>
         <w:rPr>
-          <w:rFonts w:ascii="Calibri" w:hAnsi="Calibri" w:eastAsia="Calibri"/>
+          <w:rFonts w:ascii="Calibri" w:hAnsi="Calibri" w:eastAsia="Calibri" w:cs="Calibri"/>
           <w:b/>
           <w:color w:val="1A1A1A"/>
           <w:sz w:val="22"/>
         </w:rPr>
-        <w:t xml:space="preserve">React Native Membership Platform</w:t>
+        <w:t>React Native Skia App</w:t>
       </w:r>
       <w:r>
         <w:rPr>
-          <w:rFonts w:ascii="Calibri" w:hAnsi="Calibri" w:eastAsia="Calibri"/>
+          <w:rFonts w:ascii="Calibri" w:hAnsi="Calibri" w:eastAsia="Calibri" w:cs="Calibri"/>
           <w:b w:val="0"/>
           <w:color w:val="4A4A4A"/>
           <w:sz w:val="20"/>
         </w:rPr>
         <w:tab/>
-        <w:t xml:space="preserve">Shipped Apr 2024</w:t>
+        <w:t>2024</w:t>
       </w:r>
     </w:p>
     <w:p>
       <w:pPr>
         <w:pStyle w:val="ListBullet"/>
-        <w:spacing w:after="30" w:before="0"/>
+        <w:spacing w:before="0" w:after="30" w:line="240" w:lineRule="auto"/>
         <w:ind w:left="288"/>
       </w:pPr>
       <w:r>
         <w:rPr>
-          <w:rFonts w:ascii="Calibri" w:hAnsi="Calibri" w:eastAsia="Calibri"/>
+          <w:rFonts w:ascii="Calibri" w:hAnsi="Calibri" w:eastAsia="Calibri" w:cs="Calibri"/>
           <w:b w:val="0"/>
           <w:color w:val="1A1A1A"/>
           <w:sz w:val="21"/>
         </w:rPr>
-        <w:t xml:space="preserve">Led Figma design and the iOS / Android membership app (digital card, points, offers); shipped to the App Store and Play Store. Also maintained the Express API and Next.js admin.</w:t>
+        <w:t>Owned the photobooth app from design and development through release on the Apple App Store and Google Play.</w:t>
       </w:r>
     </w:p>
     <w:p>
       <w:pPr>
         <w:pStyle w:val="ListBullet"/>
-        <w:spacing w:after="30" w:before="0"/>
+        <w:spacing w:before="0" w:after="30" w:line="240" w:lineRule="auto"/>
         <w:ind w:left="288"/>
       </w:pPr>
       <w:r>
         <w:rPr>
-          <w:rFonts w:ascii="Calibri" w:hAnsi="Calibri" w:eastAsia="Calibri"/>
+          <w:rFonts w:ascii="Calibri" w:hAnsi="Calibri" w:eastAsia="Calibri" w:cs="Calibri"/>
           <w:b w:val="0"/>
           <w:color w:val="1A1A1A"/>
           <w:sz w:val="21"/>
         </w:rPr>
-        <w:t xml:space="preserve">Diagnosed production crashes, device compatibility, and performance bottlenecks independently via Sentry across app and API; maintained </w:t>
-      </w:r>
-      <w:r>
-        <w:rPr>
-          <w:rFonts w:ascii="Calibri" w:hAnsi="Calibri" w:eastAsia="Calibri"/>
-          <w:b/>
-          <w:color w:val="1A1A1A"/>
-          <w:sz w:val="21"/>
-        </w:rPr>
-        <w:t xml:space="preserve">99%</w:t>
-      </w:r>
-      <w:r>
-        <w:rPr>
-          <w:rFonts w:ascii="Calibri" w:hAnsi="Calibri" w:eastAsia="Calibri"/>
-          <w:b w:val="0"/>
-          <w:color w:val="1A1A1A"/>
-          <w:sz w:val="21"/>
-        </w:rPr>
-        <w:t xml:space="preserve"> crash-free sessions post-launch.</w:t>
+        <w:t>Users take a selfie, load it onto the canvas, edit with stickers and pen tools, then upload and share.</w:t>
       </w:r>
     </w:p>
     <w:p>
       <w:pPr>
         <w:pStyle w:val="ListBullet"/>
-        <w:spacing w:after="30" w:before="0"/>
+        <w:spacing w:before="0" w:after="30" w:line="240" w:lineRule="auto"/>
         <w:ind w:left="288"/>
       </w:pPr>
       <w:r>
         <w:rPr>
-          <w:rFonts w:ascii="Calibri" w:hAnsi="Calibri" w:eastAsia="Calibri"/>
+          <w:rFonts w:ascii="Calibri" w:hAnsi="Calibri" w:eastAsia="Calibri" w:cs="Calibri"/>
           <w:b w:val="0"/>
           <w:color w:val="1A1A1A"/>
           <w:sz w:val="21"/>
         </w:rPr>
-        <w:t xml:space="preserve">Cut list jank with FlashList; froze inactive tabs via react-native-screens and deferred mounts; used Reanimated for native-thread transitions.</w:t>
+        <w:t>Built the canvas with React Native Skia, React Native Reanimated, and gesture handlers; captured images with react-native-vision-camera.</w:t>
       </w:r>
     </w:p>
     <w:p>
       <w:pPr>
         <w:pStyle w:val="ListBullet"/>
-        <w:spacing w:after="30" w:before="0"/>
+        <w:spacing w:before="0" w:after="30" w:line="240" w:lineRule="auto"/>
         <w:ind w:left="288"/>
       </w:pPr>
       <w:r>
         <w:rPr>
-          <w:rFonts w:ascii="Calibri" w:hAnsi="Calibri" w:eastAsia="Calibri"/>
+          <w:rFonts w:ascii="Calibri" w:hAnsi="Calibri" w:eastAsia="Calibri" w:cs="Calibri"/>
           <w:b w:val="0"/>
           <w:color w:val="1A1A1A"/>
           <w:sz w:val="21"/>
         </w:rPr>
-        <w:t xml:space="preserve">Shortened feed image loading by caching remotes and avoiding full-resolution assets in long lists.</w:t>
+        <w:t>Converted SVG stickers into Skia SVG React components, enabling resize, rotate, pan, and scale on the canvas.</w:t>
       </w:r>
     </w:p>
     <w:p>
       <w:pPr>
         <w:pStyle w:val="ListBullet"/>
-        <w:spacing w:after="30" w:before="0"/>
+        <w:spacing w:before="0" w:after="30" w:line="240" w:lineRule="auto"/>
         <w:ind w:left="288"/>
       </w:pPr>
       <w:r>
         <w:rPr>
-          <w:rFonts w:ascii="Calibri" w:hAnsi="Calibri" w:eastAsia="Calibri"/>
+          <w:rFonts w:ascii="Calibri" w:hAnsi="Calibri" w:eastAsia="Calibri" w:cs="Calibri"/>
           <w:b w:val="0"/>
           <w:color w:val="1A1A1A"/>
           <w:sz w:val="21"/>
         </w:rPr>
-        <w:t xml:space="preserve">Push + deep links via Firebase Cloud Messaging for promos and milestones.</w:t>
+        <w:t>Managed state with Zustand; kept selections atomic and debounced high-frequency updates.</w:t>
       </w:r>
     </w:p>
     <w:p>
       <w:pPr>
-        <w:spacing w:before="200" w:after="80"/>
+        <w:pStyle w:val="ListBullet"/>
+        <w:spacing w:before="0" w:after="30" w:line="240" w:lineRule="auto"/>
+        <w:ind w:left="288"/>
+      </w:pPr>
+      <w:r>
+        <w:rPr>
+          <w:rFonts w:ascii="Calibri" w:hAnsi="Calibri" w:eastAsia="Calibri" w:cs="Calibri"/>
+          <w:b w:val="0"/>
+          <w:color w:val="1A1A1A"/>
+          <w:sz w:val="21"/>
+        </w:rPr>
+        <w:t>Optimized with memoization and context isolation; held 55+ FPS in RN Perf Monitor with over 100 stickers and strokes on the canvas.</w:t>
+      </w:r>
+    </w:p>
+    <w:p>
+      <w:pPr>
+        <w:tabs>
+          <w:tab w:pos="10224" w:val="right"/>
+        </w:tabs>
+        <w:spacing w:before="160" w:after="20" w:line="240" w:lineRule="auto"/>
+      </w:pPr>
+      <w:r>
+        <w:rPr>
+          <w:rFonts w:ascii="Calibri" w:hAnsi="Calibri" w:eastAsia="Calibri" w:cs="Calibri"/>
+          <w:b/>
+          <w:color w:val="1A1A1A"/>
+          <w:sz w:val="22"/>
+        </w:rPr>
+        <w:t>React Native Student App</w:t>
+      </w:r>
+      <w:r>
+        <w:rPr>
+          <w:rFonts w:ascii="Calibri" w:hAnsi="Calibri" w:eastAsia="Calibri" w:cs="Calibri"/>
+          <w:b w:val="0"/>
+          <w:color w:val="4A4A4A"/>
+          <w:sz w:val="20"/>
+        </w:rPr>
+        <w:tab/>
+        <w:t>2023</w:t>
+      </w:r>
+    </w:p>
+    <w:p>
+      <w:pPr>
+        <w:pStyle w:val="ListBullet"/>
+        <w:spacing w:before="0" w:after="30" w:line="240" w:lineRule="auto"/>
+        <w:ind w:left="288"/>
+      </w:pPr>
+      <w:r>
+        <w:rPr>
+          <w:rFonts w:ascii="Calibri" w:hAnsi="Calibri" w:eastAsia="Calibri" w:cs="Calibri"/>
+          <w:b w:val="0"/>
+          <w:color w:val="1A1A1A"/>
+          <w:sz w:val="21"/>
+        </w:rPr>
+        <w:t>Owned student flows (course catalog, booking, announcements) from Figma through release on the Apple App Store and Google Play.</w:t>
+      </w:r>
+    </w:p>
+    <w:p>
+      <w:pPr>
+        <w:pStyle w:val="ListBullet"/>
+        <w:spacing w:before="0" w:after="30" w:line="240" w:lineRule="auto"/>
+        <w:ind w:left="288"/>
+      </w:pPr>
+      <w:r>
+        <w:rPr>
+          <w:rFonts w:ascii="Calibri" w:hAnsi="Calibri" w:eastAsia="Calibri" w:cs="Calibri"/>
+          <w:b w:val="0"/>
+          <w:color w:val="1A1A1A"/>
+          <w:sz w:val="21"/>
+        </w:rPr>
+        <w:t>Maintained 99% crash-free sessions after launch by diagnosing crashes, device compatibility issues, and API bottlenecks with Sentry.</w:t>
+      </w:r>
+    </w:p>
+    <w:p>
+      <w:pPr>
+        <w:pStyle w:val="ListBullet"/>
+        <w:spacing w:before="0" w:after="30" w:line="240" w:lineRule="auto"/>
+        <w:ind w:left="288"/>
+      </w:pPr>
+      <w:r>
+        <w:rPr>
+          <w:rFonts w:ascii="Calibri" w:hAnsi="Calibri" w:eastAsia="Calibri" w:cs="Calibri"/>
+          <w:b w:val="0"/>
+          <w:color w:val="1A1A1A"/>
+          <w:sz w:val="21"/>
+        </w:rPr>
+        <w:t>Reduced feed scroll jank after profiling identified JS-thread stalls from long lists and full-resolution images; migrated lists to FlashList with row memoization, cached and downscaled feed images, and ran Reanimated transitions and gesture handlers on the native thread.</w:t>
+      </w:r>
+    </w:p>
+    <w:p>
+      <w:pPr>
+        <w:pStyle w:val="ListBullet"/>
+        <w:spacing w:before="0" w:after="30" w:line="240" w:lineRule="auto"/>
+        <w:ind w:left="288"/>
+      </w:pPr>
+      <w:r>
+        <w:rPr>
+          <w:rFonts w:ascii="Calibri" w:hAnsi="Calibri" w:eastAsia="Calibri" w:cs="Calibri"/>
+          <w:b w:val="0"/>
+          <w:color w:val="1A1A1A"/>
+          <w:sz w:val="21"/>
+        </w:rPr>
+        <w:t>Froze inactive tabs and blurred screens, and deferred mounts, to prevent unnecessary re-renders.</w:t>
+      </w:r>
+    </w:p>
+    <w:p>
+      <w:pPr>
+        <w:pStyle w:val="ListBullet"/>
+        <w:spacing w:before="0" w:after="30" w:line="240" w:lineRule="auto"/>
+        <w:ind w:left="288"/>
+      </w:pPr>
+      <w:r>
+        <w:rPr>
+          <w:rFonts w:ascii="Calibri" w:hAnsi="Calibri" w:eastAsia="Calibri" w:cs="Calibri"/>
+          <w:b w:val="0"/>
+          <w:color w:val="1A1A1A"/>
+          <w:sz w:val="21"/>
+        </w:rPr>
+        <w:t>Routed promo and milestone notifications to the matching screen via Firebase Cloud Messaging deep links.</w:t>
+      </w:r>
+    </w:p>
+    <w:p>
+      <w:pPr>
+        <w:spacing w:before="0" w:after="60" w:line="240" w:lineRule="auto"/>
+      </w:pPr>
+      <w:r>
+        <w:rPr>
+          <w:rFonts w:ascii="Calibri" w:hAnsi="Calibri" w:eastAsia="Calibri" w:cs="Calibri"/>
+          <w:b w:val="0"/>
+          <w:i w:val="0"/>
+          <w:color w:val="4A4A4A"/>
+          <w:sz w:val="20"/>
+        </w:rPr>
+        <w:t>Across client products:</w:t>
+      </w:r>
+    </w:p>
+    <w:p>
+      <w:pPr>
+        <w:pStyle w:val="ListBullet"/>
+        <w:spacing w:before="0" w:after="30" w:line="240" w:lineRule="auto"/>
+        <w:ind w:left="288"/>
+      </w:pPr>
+      <w:r>
+        <w:rPr>
+          <w:rFonts w:ascii="Calibri" w:hAnsi="Calibri" w:eastAsia="Calibri" w:cs="Calibri"/>
+          <w:b w:val="0"/>
+          <w:color w:val="1A1A1A"/>
+          <w:sz w:val="21"/>
+        </w:rPr>
+        <w:t>Built shared design systems on Radix / Tailwind / shadcn/ui: themed with CSS tokens (color, type, space) instead of per-app hex, and exposed typed, reusable component APIs via React composition — compound components, Slot / children, and shared hooks — rather than prop-heavy leaf components. Storybook, Fumadocs, and MDX documented the contract; adoption across client apps eliminated duplicate UI.</w:t>
+      </w:r>
+    </w:p>
+    <w:p>
+      <w:pPr>
+        <w:pStyle w:val="ListBullet"/>
+        <w:spacing w:before="0" w:after="30" w:line="240" w:lineRule="auto"/>
+        <w:ind w:left="288"/>
+      </w:pPr>
+      <w:r>
+        <w:rPr>
+          <w:rFonts w:ascii="Calibri" w:hAnsi="Calibri" w:eastAsia="Calibri" w:cs="Calibri"/>
+          <w:b w:val="0"/>
+          <w:color w:val="1A1A1A"/>
+          <w:sz w:val="21"/>
+        </w:rPr>
+        <w:t>Established Vitest and Playwright / Cypress as quality gates for shared UI and the product flows using it.</w:t>
+      </w:r>
+    </w:p>
+    <w:p>
+      <w:pPr>
+        <w:pStyle w:val="ListBullet"/>
+        <w:spacing w:before="0" w:after="30" w:line="240" w:lineRule="auto"/>
+        <w:ind w:left="288"/>
+      </w:pPr>
+      <w:r>
+        <w:rPr>
+          <w:rFonts w:ascii="Calibri" w:hAnsi="Calibri" w:eastAsia="Calibri" w:cs="Calibri"/>
+          <w:b w:val="0"/>
+          <w:color w:val="1A1A1A"/>
+          <w:sz w:val="21"/>
+        </w:rPr>
+        <w:t>Instrumented client web and mobile apps and their APIs with Sentry, making production crashes, device issues, and API errors visible after release.</w:t>
+      </w:r>
+    </w:p>
+    <w:p>
+      <w:pPr>
+        <w:pStyle w:val="ListBullet"/>
+        <w:spacing w:before="0" w:after="30" w:line="240" w:lineRule="auto"/>
+        <w:ind w:left="288"/>
+      </w:pPr>
+      <w:r>
+        <w:rPr>
+          <w:rFonts w:ascii="Calibri" w:hAnsi="Calibri" w:eastAsia="Calibri" w:cs="Calibri"/>
+          <w:b w:val="0"/>
+          <w:color w:val="1A1A1A"/>
+          <w:sz w:val="21"/>
+        </w:rPr>
+        <w:t>Led adoption of tRPC and Scalar-generated API documentation, cutting API integration time by 50% and eliminating schema-mismatch errors that blocked product work.</w:t>
+      </w:r>
+    </w:p>
+    <w:p>
+      <w:pPr>
+        <w:pStyle w:val="ListBullet"/>
+        <w:spacing w:before="0" w:after="30" w:line="240" w:lineRule="auto"/>
+        <w:ind w:left="288"/>
+      </w:pPr>
+      <w:r>
+        <w:rPr>
+          <w:rFonts w:ascii="Calibri" w:hAnsi="Calibri" w:eastAsia="Calibri" w:cs="Calibri"/>
+          <w:b w:val="0"/>
+          <w:color w:val="1A1A1A"/>
+          <w:sz w:val="21"/>
+        </w:rPr>
+        <w:t>Replaced WordPress across client sites with headless CMS platforms (Strapi / Sanity) and unified search (Meilisearch / Algolia) on Next.js; cut load times by 80% and search latency by 90%, and achieved PageSpeed Insights scores above 95.</w:t>
+      </w:r>
+    </w:p>
+    <w:p>
+      <w:pPr>
+        <w:pStyle w:val="ListBullet"/>
+        <w:spacing w:before="0" w:after="30" w:line="240" w:lineRule="auto"/>
+        <w:ind w:left="288"/>
+      </w:pPr>
+      <w:r>
+        <w:rPr>
+          <w:rFonts w:ascii="Calibri" w:hAnsi="Calibri" w:eastAsia="Calibri" w:cs="Calibri"/>
+          <w:b w:val="0"/>
+          <w:color w:val="1A1A1A"/>
+          <w:sz w:val="21"/>
+        </w:rPr>
+        <w:t>Mentored summer interns and junior developers through pair programming, code reviews, and guidance as they shipped production UI.</w:t>
+      </w:r>
+    </w:p>
+    <w:p>
+      <w:pPr>
+        <w:spacing w:before="200" w:after="80" w:line="240" w:lineRule="auto"/>
         <w:pBdr>
           <w:bottom w:val="single" w:sz="12" w:space="1" w:color="2C2C2C"/>
         </w:pBdr>
       </w:pPr>
       <w:r>
         <w:rPr>
-          <w:rFonts w:ascii="Calibri" w:hAnsi="Calibri" w:eastAsia="Calibri"/>
+          <w:rFonts w:ascii="Calibri" w:hAnsi="Calibri" w:eastAsia="Calibri" w:cs="Calibri"/>
           <w:b/>
           <w:color w:val="2C2C2C"/>
           <w:sz w:val="22"/>
         </w:rPr>
-        <w:t xml:space="preserve">OTHER WORK</w:t>
+        <w:t>OTHER WORK</w:t>
       </w:r>
     </w:p>
     <w:p>
       <w:pPr>
-        <w:spacing w:after="60" w:before="0"/>
+        <w:spacing w:before="0" w:after="60" w:line="240" w:lineRule="auto"/>
       </w:pPr>
       <w:r>
         <w:rPr>
-          <w:rFonts w:ascii="Calibri" w:hAnsi="Calibri" w:eastAsia="Calibri"/>
+          <w:rFonts w:ascii="Calibri" w:hAnsi="Calibri" w:eastAsia="Calibri" w:cs="Calibri"/>
           <w:b w:val="0"/>
+          <w:i w:val="0"/>
           <w:color w:val="1A1A1A"/>
           <w:sz w:val="21"/>
         </w:rPr>
-        <w:t xml:space="preserve">Also shipped restaurant loyalty apps (React Native), campaign / e-commerce storefronts (Next.js, Shopify GraphQL), CMS content sites, and a photobooth event app (React Native, Skia).</w:t>
+        <w:t>Also shipped restaurant loyalty/student/membership apps (React Native), a homebound elderly care app (Flutter), campaign / e-commerce storefronts (Next.js, Shopify GraphQL), and CMS content sites.</w:t>
       </w:r>
     </w:p>
     <w:p>
       <w:pPr>
-        <w:spacing w:before="200" w:after="80"/>
+        <w:spacing w:before="200" w:after="80" w:line="240" w:lineRule="auto"/>
         <w:pBdr>
           <w:bottom w:val="single" w:sz="12" w:space="1" w:color="2C2C2C"/>
         </w:pBdr>
       </w:pPr>
       <w:r>
         <w:rPr>
-          <w:rFonts w:ascii="Calibri" w:hAnsi="Calibri" w:eastAsia="Calibri"/>
+          <w:rFonts w:ascii="Calibri" w:hAnsi="Calibri" w:eastAsia="Calibri" w:cs="Calibri"/>
           <w:b/>
           <w:color w:val="2C2C2C"/>
           <w:sz w:val="22"/>
         </w:rPr>
-        <w:t xml:space="preserve">SKILLS</w:t>
+        <w:t>SKILLS</w:t>
       </w:r>
     </w:p>
     <w:p>
       <w:pPr>
-        <w:spacing w:after="20" w:before="0"/>
+        <w:spacing w:before="0" w:after="20" w:line="240" w:lineRule="auto"/>
       </w:pPr>
       <w:r>
         <w:rPr>
-          <w:rFonts w:ascii="Calibri" w:hAnsi="Calibri" w:eastAsia="Calibri"/>
-          <w:b/>
-          <w:color w:val="1A1A1A"/>
-          <w:sz w:val="21"/>
-        </w:rPr>
-        <w:t xml:space="preserve">Languages: </w:t>
-      </w:r>
-      <w:r>
-        <w:rPr>
-          <w:rFonts w:ascii="Calibri" w:hAnsi="Calibri" w:eastAsia="Calibri"/>
-          <w:b w:val="0"/>
-          <w:color w:val="1A1A1A"/>
-          <w:sz w:val="21"/>
-        </w:rPr>
-        <w:t xml:space="preserve">TypeScript, Node.js</w:t>
-      </w:r>
-    </w:p>
-    <w:p>
-      <w:pPr>
-        <w:spacing w:after="20" w:before="0"/>
-      </w:pPr>
-      <w:r>
-        <w:rPr>
-          <w:rFonts w:ascii="Calibri" w:hAnsi="Calibri" w:eastAsia="Calibri"/>
+          <w:rFonts w:ascii="Calibri" w:hAnsi="Calibri" w:eastAsia="Calibri" w:cs="Calibri"/>
           <w:b/>
           <w:color w:val="1A1A1A"/>
           <w:sz w:val="21"/>
@@ -884,21 +788,67 @@
       </w:r>
       <w:r>
         <w:rPr>
-          <w:rFonts w:ascii="Calibri" w:hAnsi="Calibri" w:eastAsia="Calibri"/>
+          <w:rFonts w:ascii="Calibri" w:hAnsi="Calibri" w:eastAsia="Calibri" w:cs="Calibri"/>
           <w:b w:val="0"/>
           <w:color w:val="1A1A1A"/>
           <w:sz w:val="21"/>
         </w:rPr>
-        <w:t xml:space="preserve">React, Next.js, React Native, Expo, TanStack Query, TanStack Form, XState, TanStack Table, Framer Motion, Tailwind CSS, Chakra UI, shadcn/ui, Storybook, Figma, MDX, TipTap, D3</w:t>
+        <w:t>TypeScript, React, Next.js, React Native, Tailwind CSS, shadcn/ui, Figma, Zustand, Redux</w:t>
       </w:r>
     </w:p>
     <w:p>
       <w:pPr>
-        <w:spacing w:after="20" w:before="0"/>
+        <w:spacing w:before="0" w:after="20" w:line="240" w:lineRule="auto"/>
       </w:pPr>
       <w:r>
         <w:rPr>
-          <w:rFonts w:ascii="Calibri" w:hAnsi="Calibri" w:eastAsia="Calibri"/>
+          <w:rFonts w:ascii="Calibri" w:hAnsi="Calibri" w:eastAsia="Calibri" w:cs="Calibri"/>
+          <w:b/>
+          <w:color w:val="1A1A1A"/>
+          <w:sz w:val="21"/>
+        </w:rPr>
+        <w:t xml:space="preserve">UI behavior: </w:t>
+      </w:r>
+      <w:r>
+        <w:rPr>
+          <w:rFonts w:ascii="Calibri" w:hAnsi="Calibri" w:eastAsia="Calibri" w:cs="Calibri"/>
+          <w:b w:val="0"/>
+          <w:color w:val="1A1A1A"/>
+          <w:sz w:val="21"/>
+        </w:rPr>
+        <w:t>TanStack Query, TanStack Form, React Hook Form, XState, TanStack Table, next-intl</w:t>
+      </w:r>
+    </w:p>
+    <w:p>
+      <w:pPr>
+        <w:spacing w:before="0" w:after="20" w:line="240" w:lineRule="auto"/>
+      </w:pPr>
+      <w:r>
+        <w:rPr>
+          <w:rFonts w:ascii="Calibri" w:hAnsi="Calibri" w:eastAsia="Calibri" w:cs="Calibri"/>
+          <w:b/>
+          <w:color w:val="1A1A1A"/>
+          <w:sz w:val="21"/>
+        </w:rPr>
+        <w:t xml:space="preserve">Architecture: </w:t>
+      </w:r>
+      <w:r>
+        <w:rPr>
+          <w:rFonts w:ascii="Calibri" w:hAnsi="Calibri" w:eastAsia="Calibri" w:cs="Calibri"/>
+          <w:b w:val="0"/>
+          <w:color w:val="1A1A1A"/>
+          <w:sz w:val="21"/>
+        </w:rPr>
+        <w:t>state modeling (URL / server / local), design systems, tokens, React composition, component APIs, routing, SSR/ISR, GraphQL, tRPC, OpenAPI, Storybook, Fumadocs</w:t>
+      </w:r>
+    </w:p>
+    <w:p>
+      <w:pPr>
+        <w:spacing w:before="0" w:after="20" w:line="240" w:lineRule="auto"/>
+      </w:pPr>
+      <w:r>
+        <w:rPr>
+          <w:rFonts w:ascii="Calibri" w:hAnsi="Calibri" w:eastAsia="Calibri" w:cs="Calibri"/>
           <w:b/>
           <w:color w:val="1A1A1A"/>
           <w:sz w:val="21"/>
@@ -907,216 +857,147 @@
       </w:r>
       <w:r>
         <w:rPr>
-          <w:rFonts w:ascii="Calibri" w:hAnsi="Calibri" w:eastAsia="Calibri"/>
+          <w:rFonts w:ascii="Calibri" w:hAnsi="Calibri" w:eastAsia="Calibri" w:cs="Calibri"/>
           <w:b w:val="0"/>
           <w:color w:val="1A1A1A"/>
           <w:sz w:val="21"/>
         </w:rPr>
-        <w:t xml:space="preserve">Hono, Drizzle, Prisma, OpenAPI, tRPC, Postgres, DynamoDB, Better Auth, Multitenancy</w:t>
+        <w:t>Node.js, Hono, Drizzle, Prisma, OpenAPI, tRPC, Postgres, DynamoDB, Better Auth</w:t>
       </w:r>
     </w:p>
     <w:p>
       <w:pPr>
-        <w:spacing w:after="20" w:before="0"/>
+        <w:spacing w:before="0" w:after="20" w:line="240" w:lineRule="auto"/>
       </w:pPr>
       <w:r>
         <w:rPr>
-          <w:rFonts w:ascii="Calibri" w:hAnsi="Calibri" w:eastAsia="Calibri"/>
+          <w:rFonts w:ascii="Calibri" w:hAnsi="Calibri" w:eastAsia="Calibri" w:cs="Calibri"/>
           <w:b/>
           <w:color w:val="1A1A1A"/>
           <w:sz w:val="21"/>
         </w:rPr>
-        <w:t xml:space="preserve">Auth &amp; i18n: </w:t>
+        <w:t xml:space="preserve">AWS &amp; DevOps: </w:t>
       </w:r>
       <w:r>
         <w:rPr>
-          <w:rFonts w:ascii="Calibri" w:hAnsi="Calibri" w:eastAsia="Calibri"/>
+          <w:rFonts w:ascii="Calibri" w:hAnsi="Calibri" w:eastAsia="Calibri" w:cs="Calibri"/>
           <w:b w:val="0"/>
           <w:color w:val="1A1A1A"/>
           <w:sz w:val="21"/>
         </w:rPr>
-        <w:t xml:space="preserve">OAuth 2.0 / OIDC, JWT, HttpOnly cookies, CORS, RBAC, next-intl</w:t>
+        <w:t>SST, Docker, GitHub Actions, AWS, Vercel, Cloudflare</w:t>
       </w:r>
     </w:p>
     <w:p>
       <w:pPr>
-        <w:spacing w:after="20" w:before="0"/>
+        <w:spacing w:before="0" w:after="20" w:line="240" w:lineRule="auto"/>
       </w:pPr>
       <w:r>
         <w:rPr>
-          <w:rFonts w:ascii="Calibri" w:hAnsi="Calibri" w:eastAsia="Calibri"/>
+          <w:rFonts w:ascii="Calibri" w:hAnsi="Calibri" w:eastAsia="Calibri" w:cs="Calibri"/>
           <w:b/>
           <w:color w:val="1A1A1A"/>
           <w:sz w:val="21"/>
         </w:rPr>
-        <w:t xml:space="preserve">AI: </w:t>
+        <w:t xml:space="preserve">Quality: </w:t>
       </w:r>
       <w:r>
         <w:rPr>
-          <w:rFonts w:ascii="Calibri" w:hAnsi="Calibri" w:eastAsia="Calibri"/>
+          <w:rFonts w:ascii="Calibri" w:hAnsi="Calibri" w:eastAsia="Calibri" w:cs="Calibri"/>
           <w:b w:val="0"/>
           <w:color w:val="1A1A1A"/>
           <w:sz w:val="21"/>
         </w:rPr>
-        <w:t xml:space="preserve">Mastra, Vercel AI SDK, Langchain, Pinecone, Strands, AWS Bedrock</w:t>
+        <w:t>Vitest, Playwright, Cypress, React Testing Library, Lighthouse, axe, Sentry</w:t>
       </w:r>
     </w:p>
     <w:p>
       <w:pPr>
-        <w:spacing w:after="20" w:before="0"/>
+        <w:spacing w:before="0" w:after="20" w:line="240" w:lineRule="auto"/>
       </w:pPr>
       <w:r>
         <w:rPr>
-          <w:rFonts w:ascii="Calibri" w:hAnsi="Calibri" w:eastAsia="Calibri"/>
+          <w:rFonts w:ascii="Calibri" w:hAnsi="Calibri" w:eastAsia="Calibri" w:cs="Calibri"/>
           <w:b/>
           <w:color w:val="1A1A1A"/>
           <w:sz w:val="21"/>
         </w:rPr>
-        <w:t xml:space="preserve">Testing &amp; monitoring: </w:t>
+        <w:t xml:space="preserve">Mobile: </w:t>
       </w:r>
       <w:r>
         <w:rPr>
-          <w:rFonts w:ascii="Calibri" w:hAnsi="Calibri" w:eastAsia="Calibri"/>
+          <w:rFonts w:ascii="Calibri" w:hAnsi="Calibri" w:eastAsia="Calibri" w:cs="Calibri"/>
           <w:b w:val="0"/>
           <w:color w:val="1A1A1A"/>
           <w:sz w:val="21"/>
         </w:rPr>
-        <w:t xml:space="preserve">Cypress, Vitest, React Testing Library, Lighthouse, axe, Sentry, PostHog</w:t>
+        <w:t>Expo, FlashList, Reanimated, Moti, Skia, Unistyles, FCM</w:t>
       </w:r>
     </w:p>
     <w:p>
       <w:pPr>
-        <w:spacing w:after="20" w:before="0"/>
-      </w:pPr>
-      <w:r>
-        <w:rPr>
-          <w:rFonts w:ascii="Calibri" w:hAnsi="Calibri" w:eastAsia="Calibri"/>
-          <w:b/>
-          <w:color w:val="1A1A1A"/>
-          <w:sz w:val="21"/>
-        </w:rPr>
-        <w:t xml:space="preserve">Workflow: </w:t>
-      </w:r>
-      <w:r>
-        <w:rPr>
-          <w:rFonts w:ascii="Calibri" w:hAnsi="Calibri" w:eastAsia="Calibri"/>
-          <w:b w:val="0"/>
-          <w:color w:val="1A1A1A"/>
-          <w:sz w:val="21"/>
-        </w:rPr>
-        <w:t xml:space="preserve">Cursor, Claude Code</w:t>
-      </w:r>
-    </w:p>
-    <w:p>
-      <w:pPr>
-        <w:spacing w:after="20" w:before="0"/>
-      </w:pPr>
-      <w:r>
-        <w:rPr>
-          <w:rFonts w:ascii="Calibri" w:hAnsi="Calibri" w:eastAsia="Calibri"/>
-          <w:b/>
-          <w:color w:val="1A1A1A"/>
-          <w:sz w:val="21"/>
-        </w:rPr>
-        <w:t xml:space="preserve">DevOps: </w:t>
-      </w:r>
-      <w:r>
-        <w:rPr>
-          <w:rFonts w:ascii="Calibri" w:hAnsi="Calibri" w:eastAsia="Calibri"/>
-          <w:b w:val="0"/>
-          <w:color w:val="1A1A1A"/>
-          <w:sz w:val="21"/>
-        </w:rPr>
-        <w:t xml:space="preserve">SST, Docker, ECS Fargate, GitHub Actions, AWS</w:t>
-      </w:r>
-    </w:p>
-    <w:p>
-      <w:pPr>
-        <w:spacing w:after="20" w:before="0"/>
-      </w:pPr>
-      <w:r>
-        <w:rPr>
-          <w:rFonts w:ascii="Calibri" w:hAnsi="Calibri" w:eastAsia="Calibri"/>
-          <w:b/>
-          <w:color w:val="1A1A1A"/>
-          <w:sz w:val="21"/>
-        </w:rPr>
-        <w:t xml:space="preserve">Also used: </w:t>
-      </w:r>
-      <w:r>
-        <w:rPr>
-          <w:rFonts w:ascii="Calibri" w:hAnsi="Calibri" w:eastAsia="Calibri"/>
-          <w:b w:val="0"/>
-          <w:color w:val="1A1A1A"/>
-          <w:sz w:val="21"/>
-        </w:rPr>
-        <w:t xml:space="preserve">Strapi, Sanity, Meilisearch</w:t>
-      </w:r>
-    </w:p>
-    <w:p>
-      <w:pPr>
-        <w:spacing w:before="200" w:after="80"/>
+        <w:spacing w:before="200" w:after="80" w:line="240" w:lineRule="auto"/>
         <w:pBdr>
           <w:bottom w:val="single" w:sz="12" w:space="1" w:color="2C2C2C"/>
         </w:pBdr>
       </w:pPr>
       <w:r>
         <w:rPr>
-          <w:rFonts w:ascii="Calibri" w:hAnsi="Calibri" w:eastAsia="Calibri"/>
+          <w:rFonts w:ascii="Calibri" w:hAnsi="Calibri" w:eastAsia="Calibri" w:cs="Calibri"/>
           <w:b/>
           <w:color w:val="2C2C2C"/>
           <w:sz w:val="22"/>
         </w:rPr>
-        <w:t xml:space="preserve">QUALIFICATIONS</w:t>
+        <w:t>QUALIFICATIONS</w:t>
       </w:r>
     </w:p>
     <w:p>
       <w:pPr>
         <w:pStyle w:val="ListBullet"/>
-        <w:spacing w:after="30" w:before="0"/>
+        <w:spacing w:before="0" w:after="30" w:line="240" w:lineRule="auto"/>
         <w:ind w:left="288"/>
       </w:pPr>
       <w:r>
         <w:rPr>
-          <w:rFonts w:ascii="Calibri" w:hAnsi="Calibri" w:eastAsia="Calibri"/>
+          <w:rFonts w:ascii="Calibri" w:hAnsi="Calibri" w:eastAsia="Calibri" w:cs="Calibri"/>
           <w:b w:val="0"/>
           <w:color w:val="1A1A1A"/>
           <w:sz w:val="21"/>
         </w:rPr>
-        <w:t xml:space="preserve">AWS Solutions Architect Associate, 2026</w:t>
+        <w:t>AWS Certified Solutions Architect – Associate, 2026</w:t>
       </w:r>
     </w:p>
     <w:p>
       <w:pPr>
         <w:pStyle w:val="ListBullet"/>
-        <w:spacing w:after="30" w:before="0"/>
+        <w:spacing w:before="0" w:after="30" w:line="240" w:lineRule="auto"/>
         <w:ind w:left="288"/>
       </w:pPr>
       <w:r>
         <w:rPr>
-          <w:rFonts w:ascii="Calibri" w:hAnsi="Calibri" w:eastAsia="Calibri"/>
+          <w:rFonts w:ascii="Calibri" w:hAnsi="Calibri" w:eastAsia="Calibri" w:cs="Calibri"/>
           <w:b w:val="0"/>
           <w:color w:val="1A1A1A"/>
           <w:sz w:val="21"/>
         </w:rPr>
-        <w:t xml:space="preserve">AWS Cloud Practitioner, 2025</w:t>
+        <w:t>AWS Certified Cloud Practitioner, 2025</w:t>
       </w:r>
     </w:p>
     <w:p>
       <w:pPr>
-        <w:spacing w:before="200" w:after="80"/>
+        <w:spacing w:before="200" w:after="80" w:line="240" w:lineRule="auto"/>
         <w:pBdr>
           <w:bottom w:val="single" w:sz="12" w:space="1" w:color="2C2C2C"/>
         </w:pBdr>
       </w:pPr>
       <w:r>
         <w:rPr>
-          <w:rFonts w:ascii="Calibri" w:hAnsi="Calibri" w:eastAsia="Calibri"/>
+          <w:rFonts w:ascii="Calibri" w:hAnsi="Calibri" w:eastAsia="Calibri" w:cs="Calibri"/>
           <w:b/>
           <w:color w:val="2C2C2C"/>
           <w:sz w:val="22"/>
         </w:rPr>
-        <w:t xml:space="preserve">EDUCATION</w:t>
+        <w:t>EDUCATION</w:t>
       </w:r>
     </w:p>
     <w:p>
@@ -1124,58 +1005,58 @@
         <w:tabs>
           <w:tab w:pos="10224" w:val="right"/>
         </w:tabs>
-        <w:spacing w:before="160" w:after="20"/>
+        <w:spacing w:before="160" w:after="20" w:line="240" w:lineRule="auto"/>
       </w:pPr>
       <w:r>
         <w:rPr>
-          <w:rFonts w:ascii="Calibri" w:hAnsi="Calibri" w:eastAsia="Calibri"/>
+          <w:rFonts w:ascii="Calibri" w:hAnsi="Calibri" w:eastAsia="Calibri" w:cs="Calibri"/>
           <w:b/>
           <w:color w:val="1A1A1A"/>
           <w:sz w:val="22"/>
         </w:rPr>
-        <w:t xml:space="preserve">University College London</w:t>
+        <w:t>University College London</w:t>
       </w:r>
       <w:r>
         <w:rPr>
-          <w:rFonts w:ascii="Calibri" w:hAnsi="Calibri" w:eastAsia="Calibri"/>
+          <w:rFonts w:ascii="Calibri" w:hAnsi="Calibri" w:eastAsia="Calibri" w:cs="Calibri"/>
           <w:b w:val="0"/>
           <w:color w:val="4A4A4A"/>
           <w:sz w:val="20"/>
         </w:rPr>
         <w:tab/>
-        <w:t xml:space="preserve">2016 – 2020</w:t>
+        <w:t>2016 – 2020</w:t>
       </w:r>
     </w:p>
     <w:p>
       <w:pPr>
         <w:pStyle w:val="ListBullet"/>
-        <w:spacing w:after="30" w:before="0"/>
+        <w:spacing w:before="0" w:after="30" w:line="240" w:lineRule="auto"/>
         <w:ind w:left="288"/>
       </w:pPr>
       <w:r>
         <w:rPr>
-          <w:rFonts w:ascii="Calibri" w:hAnsi="Calibri" w:eastAsia="Calibri"/>
+          <w:rFonts w:ascii="Calibri" w:hAnsi="Calibri" w:eastAsia="Calibri" w:cs="Calibri"/>
           <w:b w:val="0"/>
           <w:color w:val="1A1A1A"/>
           <w:sz w:val="21"/>
         </w:rPr>
-        <w:t xml:space="preserve">MPharm Pharmacy — First Class Honours</w:t>
+        <w:t>Master of Pharmacy (MPharm, undergraduate) — First Class Honours</w:t>
       </w:r>
     </w:p>
     <w:p>
       <w:pPr>
         <w:pStyle w:val="ListBullet"/>
-        <w:spacing w:after="30" w:before="0"/>
+        <w:spacing w:before="0" w:after="30" w:line="240" w:lineRule="auto"/>
         <w:ind w:left="288"/>
       </w:pPr>
       <w:r>
         <w:rPr>
-          <w:rFonts w:ascii="Calibri" w:hAnsi="Calibri" w:eastAsia="Calibri"/>
+          <w:rFonts w:ascii="Calibri" w:hAnsi="Calibri" w:eastAsia="Calibri" w:cs="Calibri"/>
           <w:b w:val="0"/>
           <w:color w:val="1A1A1A"/>
           <w:sz w:val="21"/>
         </w:rPr>
-        <w:t xml:space="preserve">Passion for building things. Career switch from pharmacy to software development.</w:t>
+        <w:t>Transitioned from pharmacy to software development after finding passion in building applications.</w:t>
       </w:r>
     </w:p>
     <w:sectPr>
@@ -1551,11 +1432,8 @@
     <w:name w:val="Normal"/>
     <w:qFormat/>
     <w:rsid w:val="00FC693F"/>
-    <w:pPr>
-      <w:spacing w:after="40" w:before="0" w:line="269" w:lineRule="auto"/>
-    </w:pPr>
     <w:rPr>
-      <w:rFonts w:ascii="Calibri" w:hAnsi="Calibri" w:eastAsia="Calibri"/>
+      <w:rFonts w:ascii="Calibri" w:hAnsi="Calibri"/>
       <w:color w:val="1A1A1A"/>
       <w:sz w:val="21"/>
     </w:rPr>

</xml_diff>

<commit_message>
Enhance resume page with navigation link and update content
- Added a navigation link to switch between "frontend" and "full-stack" resume variants, improving user experience.
- Updated layout structure for better spacing and presentation on the resume page.
- Enhanced content in the "frontend" and "full-stack" resume blocks with additional details on performance optimizations and new features.
</commit_message>
<xml_diff>
--- a/apps/web/src/features/resume/wilsonchow_resume_v4_frontend.docx
+++ b/apps/web/src/features/resume/wilsonchow_resume_v4_frontend.docx
@@ -1,6 +1,6 @@
 
 <file path=word/document.xml><?xml version="1.0" encoding="utf-8"?>
-<w:document xmlns:wpc="http://schemas.microsoft.com/office/word/2010/wordprocessingCanvas" xmlns:mo="http://schemas.microsoft.com/office/mac/office/2008/main" xmlns:mc="http://schemas.openxmlformats.org/markup-compatibility/2006" xmlns:mv="urn:schemas-microsoft-com:mac:vml" xmlns:o="urn:schemas-microsoft-com:office:office" xmlns:r="http://schemas.openxmlformats.org/officeDocument/2006/relationships" xmlns:m="http://schemas.openxmlformats.org/officeDocument/2006/math" xmlns:v="urn:schemas-microsoft-com:vml" xmlns:wp14="http://schemas.microsoft.com/office/word/2010/wordprocessingDrawing" xmlns:wp="http://schemas.openxmlformats.org/drawingml/2006/wordprocessingDrawing" xmlns:w10="urn:schemas-microsoft-com:office:word" xmlns:w="http://schemas.openxmlformats.org/wordprocessingml/2006/main" xmlns:w14="http://schemas.microsoft.com/office/word/2010/wordml" xmlns:wpg="http://schemas.microsoft.com/office/word/2010/wordprocessingGroup" xmlns:wpi="http://schemas.microsoft.com/office/word/2010/wordprocessingInk" xmlns:wne="http://schemas.microsoft.com/office/word/2006/wordml" xmlns:wps="http://schemas.microsoft.com/office/word/2010/wordprocessingShape" mc:Ignorable="w14 wp14">
+<w:document xmlns:mc="http://schemas.openxmlformats.org/markup-compatibility/2006" xmlns:w="http://schemas.openxmlformats.org/wordprocessingml/2006/main" mc:Ignorable="w14 wp14">
   <w:body>
     <w:p>
       <w:pPr>
@@ -71,12 +71,62 @@
       <w:r>
         <w:rPr>
           <w:rFonts w:ascii="Calibri" w:hAnsi="Calibri" w:eastAsia="Calibri" w:cs="Calibri"/>
+          <w:b/>
+          <w:i w:val="0"/>
+          <w:color w:val="1A1A1A"/>
+          <w:sz w:val="21"/>
+        </w:rPr>
+        <w:t>Senior product frontend engineer</w:t>
+      </w:r>
+      <w:r>
+        <w:rPr>
+          <w:rFonts w:ascii="Calibri" w:hAnsi="Calibri" w:eastAsia="Calibri" w:cs="Calibri"/>
           <w:b w:val="0"/>
           <w:i w:val="0"/>
           <w:color w:val="1A1A1A"/>
           <w:sz w:val="21"/>
         </w:rPr>
-        <w:t>Senior product frontend engineer with 5 years of experience owning React and React Native product flows — from Figma and design systems through frontend development, tRPC APIs, and release. Pays close attention to UI and UX details, not only whether the flow ships. Shipped 15+ production apps.</w:t>
+        <w:t xml:space="preserve"> with </w:t>
+      </w:r>
+      <w:r>
+        <w:rPr>
+          <w:rFonts w:ascii="Calibri" w:hAnsi="Calibri" w:eastAsia="Calibri" w:cs="Calibri"/>
+          <w:b/>
+          <w:i w:val="0"/>
+          <w:color w:val="1A1A1A"/>
+          <w:sz w:val="21"/>
+        </w:rPr>
+        <w:t>5 years of experience</w:t>
+      </w:r>
+      <w:r>
+        <w:rPr>
+          <w:rFonts w:ascii="Calibri" w:hAnsi="Calibri" w:eastAsia="Calibri" w:cs="Calibri"/>
+          <w:b w:val="0"/>
+          <w:i w:val="0"/>
+          <w:color w:val="1A1A1A"/>
+          <w:sz w:val="21"/>
+        </w:rPr>
+        <w:t xml:space="preserve"> owning React and React Native product flows — from Figma and design systems through frontend development, tRPC APIs, and release. Pays close attention to UI and UX details, not only whether the flow ships. Shipped </w:t>
+      </w:r>
+      <w:r>
+        <w:rPr>
+          <w:rFonts w:ascii="Calibri" w:hAnsi="Calibri" w:eastAsia="Calibri" w:cs="Calibri"/>
+          <w:b/>
+          <w:i w:val="0"/>
+          <w:color w:val="1A1A1A"/>
+          <w:sz w:val="21"/>
+        </w:rPr>
+        <w:t>15+</w:t>
+      </w:r>
+      <w:r>
+        <w:rPr>
+          <w:rFonts w:ascii="Calibri" w:hAnsi="Calibri" w:eastAsia="Calibri" w:cs="Calibri"/>
+          <w:b w:val="0"/>
+          <w:i w:val="0"/>
+          <w:color w:val="1A1A1A"/>
+          <w:sz w:val="21"/>
+        </w:rPr>
+        <w:t xml:space="preserve"> production apps.</w:t>
       </w:r>
     </w:p>
     <w:p>
@@ -178,7 +228,25 @@
           <w:color w:val="1A1A1A"/>
           <w:sz w:val="21"/>
         </w:rPr>
-        <w:t>Designed the chat and admin UX in Figma and owned the client-facing flows — document upload, in-chat questionnaire, product and cart actions.</w:t>
+        <w:t xml:space="preserve">Designed the chat and admin UX in </w:t>
+      </w:r>
+      <w:r>
+        <w:rPr>
+          <w:rFonts w:ascii="Calibri" w:hAnsi="Calibri" w:eastAsia="Calibri" w:cs="Calibri"/>
+          <w:b/>
+          <w:color w:val="1A1A1A"/>
+          <w:sz w:val="21"/>
+        </w:rPr>
+        <w:t>Figma</w:t>
+      </w:r>
+      <w:r>
+        <w:rPr>
+          <w:rFonts w:ascii="Calibri" w:hAnsi="Calibri" w:eastAsia="Calibri" w:cs="Calibri"/>
+          <w:b w:val="0"/>
+          <w:color w:val="1A1A1A"/>
+          <w:sz w:val="21"/>
+        </w:rPr>
+        <w:t xml:space="preserve"> and owned the client-facing flows — document upload, in-chat questionnaire, product and cart actions.</w:t>
       </w:r>
     </w:p>
     <w:p>
@@ -194,7 +262,25 @@
           <w:color w:val="1A1A1A"/>
           <w:sz w:val="21"/>
         </w:rPr>
-        <w:t>Hardened Next.js admin and client apps with Better Auth, HttpOnly cookies, CORS, and RBAC.</w:t>
+        <w:t xml:space="preserve">Hardened Next.js admin and client apps with </w:t>
+      </w:r>
+      <w:r>
+        <w:rPr>
+          <w:rFonts w:ascii="Calibri" w:hAnsi="Calibri" w:eastAsia="Calibri" w:cs="Calibri"/>
+          <w:b/>
+          <w:color w:val="1A1A1A"/>
+          <w:sz w:val="21"/>
+        </w:rPr>
+        <w:t>Better Auth</w:t>
+      </w:r>
+      <w:r>
+        <w:rPr>
+          <w:rFonts w:ascii="Calibri" w:hAnsi="Calibri" w:eastAsia="Calibri" w:cs="Calibri"/>
+          <w:b w:val="0"/>
+          <w:color w:val="1A1A1A"/>
+          <w:sz w:val="21"/>
+        </w:rPr>
+        <w:t>, HttpOnly cookies, CORS, and RBAC.</w:t>
       </w:r>
     </w:p>
     <w:p>
@@ -210,7 +296,43 @@
           <w:color w:val="1A1A1A"/>
           <w:sz w:val="21"/>
         </w:rPr>
-        <w:t>Streamed LangGraph agent replies into the chat with the AI SDK over tRPC, rendering tool calls as product cards, cart actions, and questionnaires instead of plain text.</w:t>
+        <w:t xml:space="preserve">Streamed </w:t>
+      </w:r>
+      <w:r>
+        <w:rPr>
+          <w:rFonts w:ascii="Calibri" w:hAnsi="Calibri" w:eastAsia="Calibri" w:cs="Calibri"/>
+          <w:b/>
+          <w:color w:val="1A1A1A"/>
+          <w:sz w:val="21"/>
+        </w:rPr>
+        <w:t>LangGraph</w:t>
+      </w:r>
+      <w:r>
+        <w:rPr>
+          <w:rFonts w:ascii="Calibri" w:hAnsi="Calibri" w:eastAsia="Calibri" w:cs="Calibri"/>
+          <w:b w:val="0"/>
+          <w:color w:val="1A1A1A"/>
+          <w:sz w:val="21"/>
+        </w:rPr>
+        <w:t xml:space="preserve"> agent replies into the chat with the </w:t>
+      </w:r>
+      <w:r>
+        <w:rPr>
+          <w:rFonts w:ascii="Calibri" w:hAnsi="Calibri" w:eastAsia="Calibri" w:cs="Calibri"/>
+          <w:b/>
+          <w:color w:val="1A1A1A"/>
+          <w:sz w:val="21"/>
+        </w:rPr>
+        <w:t>AI SDK</w:t>
+      </w:r>
+      <w:r>
+        <w:rPr>
+          <w:rFonts w:ascii="Calibri" w:hAnsi="Calibri" w:eastAsia="Calibri" w:cs="Calibri"/>
+          <w:b w:val="0"/>
+          <w:color w:val="1A1A1A"/>
+          <w:sz w:val="21"/>
+        </w:rPr>
+        <w:t xml:space="preserve"> over tRPC, rendering tool calls as product cards, cart actions, and questionnaires instead of plain text.</w:t>
       </w:r>
     </w:p>
     <w:p>
@@ -242,7 +364,43 @@
           <w:color w:val="1A1A1A"/>
           <w:sz w:val="21"/>
         </w:rPr>
-        <w:t>Optimized expensive components with memoization and useTransition for heavy UI updates.</w:t>
+        <w:t xml:space="preserve">Optimized expensive components with </w:t>
+      </w:r>
+      <w:r>
+        <w:rPr>
+          <w:rFonts w:ascii="Calibri" w:hAnsi="Calibri" w:eastAsia="Calibri" w:cs="Calibri"/>
+          <w:b/>
+          <w:color w:val="1A1A1A"/>
+          <w:sz w:val="21"/>
+        </w:rPr>
+        <w:t>memoization</w:t>
+      </w:r>
+      <w:r>
+        <w:rPr>
+          <w:rFonts w:ascii="Calibri" w:hAnsi="Calibri" w:eastAsia="Calibri" w:cs="Calibri"/>
+          <w:b w:val="0"/>
+          <w:color w:val="1A1A1A"/>
+          <w:sz w:val="21"/>
+        </w:rPr>
+        <w:t xml:space="preserve"> and </w:t>
+      </w:r>
+      <w:r>
+        <w:rPr>
+          <w:rFonts w:ascii="Calibri" w:hAnsi="Calibri" w:eastAsia="Calibri" w:cs="Calibri"/>
+          <w:b/>
+          <w:color w:val="1A1A1A"/>
+          <w:sz w:val="21"/>
+        </w:rPr>
+        <w:t>useTransition</w:t>
+      </w:r>
+      <w:r>
+        <w:rPr>
+          <w:rFonts w:ascii="Calibri" w:hAnsi="Calibri" w:eastAsia="Calibri" w:cs="Calibri"/>
+          <w:b w:val="0"/>
+          <w:color w:val="1A1A1A"/>
+          <w:sz w:val="21"/>
+        </w:rPr>
+        <w:t xml:space="preserve"> for heavy UI updates.</w:t>
       </w:r>
     </w:p>
     <w:p>
@@ -258,7 +416,43 @@
           <w:color w:val="1A1A1A"/>
           <w:sz w:val="21"/>
         </w:rPr>
-        <w:t>Used TanStack Query with server prefetch and client-side rehydration for data lists, and TanStack Table with pagination, filters, and sorting; stored table state in URL search parameters so lists stay shareable and bookmarkable.</w:t>
+        <w:t xml:space="preserve">Used </w:t>
+      </w:r>
+      <w:r>
+        <w:rPr>
+          <w:rFonts w:ascii="Calibri" w:hAnsi="Calibri" w:eastAsia="Calibri" w:cs="Calibri"/>
+          <w:b/>
+          <w:color w:val="1A1A1A"/>
+          <w:sz w:val="21"/>
+        </w:rPr>
+        <w:t>TanStack Query</w:t>
+      </w:r>
+      <w:r>
+        <w:rPr>
+          <w:rFonts w:ascii="Calibri" w:hAnsi="Calibri" w:eastAsia="Calibri" w:cs="Calibri"/>
+          <w:b w:val="0"/>
+          <w:color w:val="1A1A1A"/>
+          <w:sz w:val="21"/>
+        </w:rPr>
+        <w:t xml:space="preserve"> with server prefetch and client-side rehydration for data lists, and </w:t>
+      </w:r>
+      <w:r>
+        <w:rPr>
+          <w:rFonts w:ascii="Calibri" w:hAnsi="Calibri" w:eastAsia="Calibri" w:cs="Calibri"/>
+          <w:b/>
+          <w:color w:val="1A1A1A"/>
+          <w:sz w:val="21"/>
+        </w:rPr>
+        <w:t>TanStack Table</w:t>
+      </w:r>
+      <w:r>
+        <w:rPr>
+          <w:rFonts w:ascii="Calibri" w:hAnsi="Calibri" w:eastAsia="Calibri" w:cs="Calibri"/>
+          <w:b w:val="0"/>
+          <w:color w:val="1A1A1A"/>
+          <w:sz w:val="21"/>
+        </w:rPr>
+        <w:t xml:space="preserve"> with pagination, filters, and sorting; stored table state in URL search parameters so lists stay shareable and bookmarkable.</w:t>
       </w:r>
     </w:p>
     <w:p>
@@ -274,7 +468,61 @@
           <w:color w:val="1A1A1A"/>
           <w:sz w:val="21"/>
         </w:rPr>
-        <w:t>Modeled multi-step health questionnaires with XState and React Hook Form / Zod.</w:t>
+        <w:t xml:space="preserve">Modeled multi-step health questionnaires with </w:t>
+      </w:r>
+      <w:r>
+        <w:rPr>
+          <w:rFonts w:ascii="Calibri" w:hAnsi="Calibri" w:eastAsia="Calibri" w:cs="Calibri"/>
+          <w:b/>
+          <w:color w:val="1A1A1A"/>
+          <w:sz w:val="21"/>
+        </w:rPr>
+        <w:t>XState</w:t>
+      </w:r>
+      <w:r>
+        <w:rPr>
+          <w:rFonts w:ascii="Calibri" w:hAnsi="Calibri" w:eastAsia="Calibri" w:cs="Calibri"/>
+          <w:b w:val="0"/>
+          <w:color w:val="1A1A1A"/>
+          <w:sz w:val="21"/>
+        </w:rPr>
+        <w:t xml:space="preserve"> and </w:t>
+      </w:r>
+      <w:r>
+        <w:rPr>
+          <w:rFonts w:ascii="Calibri" w:hAnsi="Calibri" w:eastAsia="Calibri" w:cs="Calibri"/>
+          <w:b/>
+          <w:color w:val="1A1A1A"/>
+          <w:sz w:val="21"/>
+        </w:rPr>
+        <w:t>React Hook Form</w:t>
+      </w:r>
+      <w:r>
+        <w:rPr>
+          <w:rFonts w:ascii="Calibri" w:hAnsi="Calibri" w:eastAsia="Calibri" w:cs="Calibri"/>
+          <w:b w:val="0"/>
+          <w:color w:val="1A1A1A"/>
+          <w:sz w:val="21"/>
+        </w:rPr>
+        <w:t xml:space="preserve"> / </w:t>
+      </w:r>
+      <w:r>
+        <w:rPr>
+          <w:rFonts w:ascii="Calibri" w:hAnsi="Calibri" w:eastAsia="Calibri" w:cs="Calibri"/>
+          <w:b/>
+          <w:color w:val="1A1A1A"/>
+          <w:sz w:val="21"/>
+        </w:rPr>
+        <w:t>Zod</w:t>
+      </w:r>
+      <w:r>
+        <w:rPr>
+          <w:rFonts w:ascii="Calibri" w:hAnsi="Calibri" w:eastAsia="Calibri" w:cs="Calibri"/>
+          <w:b w:val="0"/>
+          <w:color w:val="1A1A1A"/>
+          <w:sz w:val="21"/>
+        </w:rPr>
+        <w:t>.</w:t>
       </w:r>
     </w:p>
     <w:p>
@@ -316,7 +564,27 @@
           <w:color w:val="4A4A4A"/>
           <w:sz w:val="20"/>
         </w:rPr>
-        <w:t>Led frontend development for a content and search editorial platform built with Strapi CMS, Meilisearch, and Next.js.</w:t>
+        <w:t xml:space="preserve">Led frontend development for a content and search editorial platform built with Strapi CMS, Meilisearch, and </w:t>
+      </w:r>
+      <w:r>
+        <w:rPr>
+          <w:rFonts w:ascii="Calibri" w:hAnsi="Calibri" w:eastAsia="Calibri" w:cs="Calibri"/>
+          <w:b/>
+          <w:i w:val="0"/>
+          <w:color w:val="4A4A4A"/>
+          <w:sz w:val="20"/>
+        </w:rPr>
+        <w:t>Next.js</w:t>
+      </w:r>
+      <w:r>
+        <w:rPr>
+          <w:rFonts w:ascii="Calibri" w:hAnsi="Calibri" w:eastAsia="Calibri" w:cs="Calibri"/>
+          <w:b w:val="0"/>
+          <w:i w:val="0"/>
+          <w:color w:val="4A4A4A"/>
+          <w:sz w:val="20"/>
+        </w:rPr>
+        <w:t>.</w:t>
       </w:r>
     </w:p>
     <w:p>
@@ -332,7 +600,43 @@
           <w:color w:val="1A1A1A"/>
           <w:sz w:val="21"/>
         </w:rPr>
-        <w:t>Latest 100 articles statically rendered at build time, leaving the rest incrementally rendered on demand. Strapi GraphQL queries tagged properly with Next.js cache tags; revalidated through webhook triggered by content update events.</w:t>
+        <w:t xml:space="preserve">Latest 100 articles statically rendered at build time, leaving the rest incrementally rendered on demand. Strapi </w:t>
+      </w:r>
+      <w:r>
+        <w:rPr>
+          <w:rFonts w:ascii="Calibri" w:hAnsi="Calibri" w:eastAsia="Calibri" w:cs="Calibri"/>
+          <w:b/>
+          <w:color w:val="1A1A1A"/>
+          <w:sz w:val="21"/>
+        </w:rPr>
+        <w:t>GraphQL</w:t>
+      </w:r>
+      <w:r>
+        <w:rPr>
+          <w:rFonts w:ascii="Calibri" w:hAnsi="Calibri" w:eastAsia="Calibri" w:cs="Calibri"/>
+          <w:b w:val="0"/>
+          <w:color w:val="1A1A1A"/>
+          <w:sz w:val="21"/>
+        </w:rPr>
+        <w:t xml:space="preserve"> queries tagged properly with </w:t>
+      </w:r>
+      <w:r>
+        <w:rPr>
+          <w:rFonts w:ascii="Calibri" w:hAnsi="Calibri" w:eastAsia="Calibri" w:cs="Calibri"/>
+          <w:b/>
+          <w:color w:val="1A1A1A"/>
+          <w:sz w:val="21"/>
+        </w:rPr>
+        <w:t>Next.js</w:t>
+      </w:r>
+      <w:r>
+        <w:rPr>
+          <w:rFonts w:ascii="Calibri" w:hAnsi="Calibri" w:eastAsia="Calibri" w:cs="Calibri"/>
+          <w:b w:val="0"/>
+          <w:color w:val="1A1A1A"/>
+          <w:sz w:val="21"/>
+        </w:rPr>
+        <w:t xml:space="preserve"> cache tags; revalidated through webhook triggered by content update events.</w:t>
       </w:r>
     </w:p>
     <w:p>
@@ -348,7 +652,25 @@
           <w:color w:val="1A1A1A"/>
           <w:sz w:val="21"/>
         </w:rPr>
-        <w:t>Shipped instant search feature using Meilisearch with full-text search and fuzzy matching; result hits in &lt; 50ms.</w:t>
+        <w:t xml:space="preserve">Shipped instant search feature using Meilisearch with full-text search and fuzzy matching; result hits in </w:t>
+      </w:r>
+      <w:r>
+        <w:rPr>
+          <w:rFonts w:ascii="Calibri" w:hAnsi="Calibri" w:eastAsia="Calibri" w:cs="Calibri"/>
+          <w:b/>
+          <w:color w:val="1A1A1A"/>
+          <w:sz w:val="21"/>
+        </w:rPr>
+        <w:t>&lt; 50ms</w:t>
+      </w:r>
+      <w:r>
+        <w:rPr>
+          <w:rFonts w:ascii="Calibri" w:hAnsi="Calibri" w:eastAsia="Calibri" w:cs="Calibri"/>
+          <w:b w:val="0"/>
+          <w:color w:val="1A1A1A"/>
+          <w:sz w:val="21"/>
+        </w:rPr>
+        <w:t>.</w:t>
       </w:r>
     </w:p>
     <w:p>
@@ -364,7 +686,133 @@
           <w:color w:val="1A1A1A"/>
           <w:sz w:val="21"/>
         </w:rPr>
-        <w:t>PageSpeed Insights average scores &gt;90; Reserved image space to prevent layout shifts and used caching and image optimization to reduce LCP: FCP &lt; 0.3s, LCP &lt; 0.5s, CLS &lt; 0.001.</w:t>
+        <w:t xml:space="preserve">PageSpeed Insights average scores </w:t>
+      </w:r>
+      <w:r>
+        <w:rPr>
+          <w:rFonts w:ascii="Calibri" w:hAnsi="Calibri" w:eastAsia="Calibri" w:cs="Calibri"/>
+          <w:b/>
+          <w:color w:val="1A1A1A"/>
+          <w:sz w:val="21"/>
+        </w:rPr>
+        <w:t>&gt;90</w:t>
+      </w:r>
+      <w:r>
+        <w:rPr>
+          <w:rFonts w:ascii="Calibri" w:hAnsi="Calibri" w:eastAsia="Calibri" w:cs="Calibri"/>
+          <w:b w:val="0"/>
+          <w:color w:val="1A1A1A"/>
+          <w:sz w:val="21"/>
+        </w:rPr>
+        <w:t xml:space="preserve">; Reserved image space to prevent layout shifts and used </w:t>
+      </w:r>
+      <w:r>
+        <w:rPr>
+          <w:rFonts w:ascii="Calibri" w:hAnsi="Calibri" w:eastAsia="Calibri" w:cs="Calibri"/>
+          <w:b/>
+          <w:color w:val="1A1A1A"/>
+          <w:sz w:val="21"/>
+        </w:rPr>
+        <w:t>caching</w:t>
+      </w:r>
+      <w:r>
+        <w:rPr>
+          <w:rFonts w:ascii="Calibri" w:hAnsi="Calibri" w:eastAsia="Calibri" w:cs="Calibri"/>
+          <w:b w:val="0"/>
+          <w:color w:val="1A1A1A"/>
+          <w:sz w:val="21"/>
+        </w:rPr>
+        <w:t xml:space="preserve"> and </w:t>
+      </w:r>
+      <w:r>
+        <w:rPr>
+          <w:rFonts w:ascii="Calibri" w:hAnsi="Calibri" w:eastAsia="Calibri" w:cs="Calibri"/>
+          <w:b/>
+          <w:color w:val="1A1A1A"/>
+          <w:sz w:val="21"/>
+        </w:rPr>
+        <w:t>image optimization</w:t>
+      </w:r>
+      <w:r>
+        <w:rPr>
+          <w:rFonts w:ascii="Calibri" w:hAnsi="Calibri" w:eastAsia="Calibri" w:cs="Calibri"/>
+          <w:b w:val="0"/>
+          <w:color w:val="1A1A1A"/>
+          <w:sz w:val="21"/>
+        </w:rPr>
+        <w:t xml:space="preserve"> (enforced webp / avif formats and compression to </w:t>
+      </w:r>
+      <w:r>
+        <w:rPr>
+          <w:rFonts w:ascii="Calibri" w:hAnsi="Calibri" w:eastAsia="Calibri" w:cs="Calibri"/>
+          <w:b/>
+          <w:color w:val="1A1A1A"/>
+          <w:sz w:val="21"/>
+        </w:rPr>
+        <w:t>&lt; 100 KB</w:t>
+      </w:r>
+      <w:r>
+        <w:rPr>
+          <w:rFonts w:ascii="Calibri" w:hAnsi="Calibri" w:eastAsia="Calibri" w:cs="Calibri"/>
+          <w:b w:val="0"/>
+          <w:color w:val="1A1A1A"/>
+          <w:sz w:val="21"/>
+        </w:rPr>
+        <w:t xml:space="preserve">) to reduce LCP: </w:t>
+      </w:r>
+      <w:r>
+        <w:rPr>
+          <w:rFonts w:ascii="Calibri" w:hAnsi="Calibri" w:eastAsia="Calibri" w:cs="Calibri"/>
+          <w:b/>
+          <w:color w:val="1A1A1A"/>
+          <w:sz w:val="21"/>
+        </w:rPr>
+        <w:t>FCP &lt; 0.3s</w:t>
+      </w:r>
+      <w:r>
+        <w:rPr>
+          <w:rFonts w:ascii="Calibri" w:hAnsi="Calibri" w:eastAsia="Calibri" w:cs="Calibri"/>
+          <w:b w:val="0"/>
+          <w:color w:val="1A1A1A"/>
+          <w:sz w:val="21"/>
+        </w:rPr>
+        <w:t xml:space="preserve">, </w:t>
+      </w:r>
+      <w:r>
+        <w:rPr>
+          <w:rFonts w:ascii="Calibri" w:hAnsi="Calibri" w:eastAsia="Calibri" w:cs="Calibri"/>
+          <w:b/>
+          <w:color w:val="1A1A1A"/>
+          <w:sz w:val="21"/>
+        </w:rPr>
+        <w:t>LCP &lt; 0.5s</w:t>
+      </w:r>
+      <w:r>
+        <w:rPr>
+          <w:rFonts w:ascii="Calibri" w:hAnsi="Calibri" w:eastAsia="Calibri" w:cs="Calibri"/>
+          <w:b w:val="0"/>
+          <w:color w:val="1A1A1A"/>
+          <w:sz w:val="21"/>
+        </w:rPr>
+        <w:t xml:space="preserve">, </w:t>
+      </w:r>
+      <w:r>
+        <w:rPr>
+          <w:rFonts w:ascii="Calibri" w:hAnsi="Calibri" w:eastAsia="Calibri" w:cs="Calibri"/>
+          <w:b/>
+          <w:color w:val="1A1A1A"/>
+          <w:sz w:val="21"/>
+        </w:rPr>
+        <w:t>CLS &lt; 0.001</w:t>
+      </w:r>
+      <w:r>
+        <w:rPr>
+          <w:rFonts w:ascii="Calibri" w:hAnsi="Calibri" w:eastAsia="Calibri" w:cs="Calibri"/>
+          <w:b w:val="0"/>
+          <w:color w:val="1A1A1A"/>
+          <w:sz w:val="21"/>
+        </w:rPr>
+        <w:t>.</w:t>
       </w:r>
     </w:p>
     <w:p>
@@ -381,6 +829,22 @@
           <w:sz w:val="21"/>
         </w:rPr>
         <w:t>Treated keyboard-accessible navigation, accessible form-error handling, semantic structure, and Lighthouse / axe checks as release requirements rather than post-launch fixes.</w:t>
+      </w:r>
+    </w:p>
+    <w:p>
+      <w:pPr>
+        <w:pStyle w:val="ListBullet"/>
+        <w:spacing w:before="0" w:after="30" w:line="240" w:lineRule="auto"/>
+        <w:ind w:left="288"/>
+      </w:pPr>
+      <w:r>
+        <w:rPr>
+          <w:rFonts w:ascii="Calibri" w:hAnsi="Calibri" w:eastAsia="Calibri" w:cs="Calibri"/>
+          <w:b w:val="0"/>
+          <w:color w:val="1A1A1A"/>
+          <w:sz w:val="21"/>
+        </w:rPr>
+        <w:t>Built a Strapi plugin for AI content generation with AI SDK.</w:t>
       </w:r>
     </w:p>
     <w:p>
@@ -487,7 +951,25 @@
           <w:color w:val="1A1A1A"/>
           <w:sz w:val="21"/>
         </w:rPr>
-        <w:t>Managed state with Zustand; kept selections atomic and debounced high-frequency updates.</w:t>
+        <w:t xml:space="preserve">Managed state with </w:t>
+      </w:r>
+      <w:r>
+        <w:rPr>
+          <w:rFonts w:ascii="Calibri" w:hAnsi="Calibri" w:eastAsia="Calibri" w:cs="Calibri"/>
+          <w:b/>
+          <w:color w:val="1A1A1A"/>
+          <w:sz w:val="21"/>
+        </w:rPr>
+        <w:t>Zustand</w:t>
+      </w:r>
+      <w:r>
+        <w:rPr>
+          <w:rFonts w:ascii="Calibri" w:hAnsi="Calibri" w:eastAsia="Calibri" w:cs="Calibri"/>
+          <w:b w:val="0"/>
+          <w:color w:val="1A1A1A"/>
+          <w:sz w:val="21"/>
+        </w:rPr>
+        <w:t>; kept selections atomic and debounced high-frequency updates.</w:t>
       </w:r>
     </w:p>
     <w:p>
@@ -503,7 +985,25 @@
           <w:color w:val="1A1A1A"/>
           <w:sz w:val="21"/>
         </w:rPr>
-        <w:t>Optimized with memoization and context isolation; held 55+ FPS in RN Perf Monitor with over 100 stickers and strokes on the canvas.</w:t>
+        <w:t xml:space="preserve">Optimized with memoization and context isolation; held </w:t>
+      </w:r>
+      <w:r>
+        <w:rPr>
+          <w:rFonts w:ascii="Calibri" w:hAnsi="Calibri" w:eastAsia="Calibri" w:cs="Calibri"/>
+          <w:b/>
+          <w:color w:val="1A1A1A"/>
+          <w:sz w:val="21"/>
+        </w:rPr>
+        <w:t>55+ FPS</w:t>
+      </w:r>
+      <w:r>
+        <w:rPr>
+          <w:rFonts w:ascii="Calibri" w:hAnsi="Calibri" w:eastAsia="Calibri" w:cs="Calibri"/>
+          <w:b w:val="0"/>
+          <w:color w:val="1A1A1A"/>
+          <w:sz w:val="21"/>
+        </w:rPr>
+        <w:t xml:space="preserve"> in RN Perf Monitor with over 100 stickers and strokes on the canvas.</w:t>
       </w:r>
     </w:p>
     <w:p>
@@ -562,7 +1062,43 @@
           <w:color w:val="1A1A1A"/>
           <w:sz w:val="21"/>
         </w:rPr>
-        <w:t>Maintained 99% crash-free sessions after launch by diagnosing crashes, device compatibility issues, and API bottlenecks with Sentry.</w:t>
+        <w:t xml:space="preserve">Maintained </w:t>
+      </w:r>
+      <w:r>
+        <w:rPr>
+          <w:rFonts w:ascii="Calibri" w:hAnsi="Calibri" w:eastAsia="Calibri" w:cs="Calibri"/>
+          <w:b/>
+          <w:color w:val="1A1A1A"/>
+          <w:sz w:val="21"/>
+        </w:rPr>
+        <w:t>99%</w:t>
+      </w:r>
+      <w:r>
+        <w:rPr>
+          <w:rFonts w:ascii="Calibri" w:hAnsi="Calibri" w:eastAsia="Calibri" w:cs="Calibri"/>
+          <w:b w:val="0"/>
+          <w:color w:val="1A1A1A"/>
+          <w:sz w:val="21"/>
+        </w:rPr>
+        <w:t xml:space="preserve"> crash-free sessions after launch by diagnosing crashes, device compatibility issues, and API bottlenecks with </w:t>
+      </w:r>
+      <w:r>
+        <w:rPr>
+          <w:rFonts w:ascii="Calibri" w:hAnsi="Calibri" w:eastAsia="Calibri" w:cs="Calibri"/>
+          <w:b/>
+          <w:color w:val="1A1A1A"/>
+          <w:sz w:val="21"/>
+        </w:rPr>
+        <w:t>Sentry</w:t>
+      </w:r>
+      <w:r>
+        <w:rPr>
+          <w:rFonts w:ascii="Calibri" w:hAnsi="Calibri" w:eastAsia="Calibri" w:cs="Calibri"/>
+          <w:b w:val="0"/>
+          <w:color w:val="1A1A1A"/>
+          <w:sz w:val="21"/>
+        </w:rPr>
+        <w:t>.</w:t>
       </w:r>
     </w:p>
     <w:p>
@@ -578,7 +1114,95 @@
           <w:color w:val="1A1A1A"/>
           <w:sz w:val="21"/>
         </w:rPr>
-        <w:t>Reduced feed scroll jank after profiling identified JS-thread stalls from long lists and full-resolution images; migrated lists to FlashList with row memoization, cached and downscaled feed images, and ran Reanimated transitions and gesture handlers on the native thread.</w:t>
+        <w:t xml:space="preserve">Data fetched with </w:t>
+      </w:r>
+      <w:r>
+        <w:rPr>
+          <w:rFonts w:ascii="Calibri" w:hAnsi="Calibri" w:eastAsia="Calibri" w:cs="Calibri"/>
+          <w:b/>
+          <w:color w:val="1A1A1A"/>
+          <w:sz w:val="21"/>
+        </w:rPr>
+        <w:t>Tanstack Query</w:t>
+      </w:r>
+      <w:r>
+        <w:rPr>
+          <w:rFonts w:ascii="Calibri" w:hAnsi="Calibri" w:eastAsia="Calibri" w:cs="Calibri"/>
+          <w:b w:val="0"/>
+          <w:color w:val="1A1A1A"/>
+          <w:sz w:val="21"/>
+        </w:rPr>
+        <w:t xml:space="preserve">, cut duplicate fetches with cache and staleTime; client state managed with </w:t>
+      </w:r>
+      <w:r>
+        <w:rPr>
+          <w:rFonts w:ascii="Calibri" w:hAnsi="Calibri" w:eastAsia="Calibri" w:cs="Calibri"/>
+          <w:b/>
+          <w:color w:val="1A1A1A"/>
+          <w:sz w:val="21"/>
+        </w:rPr>
+        <w:t>Redux Toolkit</w:t>
+      </w:r>
+      <w:r>
+        <w:rPr>
+          <w:rFonts w:ascii="Calibri" w:hAnsi="Calibri" w:eastAsia="Calibri" w:cs="Calibri"/>
+          <w:b w:val="0"/>
+          <w:color w:val="1A1A1A"/>
+          <w:sz w:val="21"/>
+        </w:rPr>
+        <w:t>.</w:t>
+      </w:r>
+    </w:p>
+    <w:p>
+      <w:pPr>
+        <w:pStyle w:val="ListBullet"/>
+        <w:spacing w:before="0" w:after="30" w:line="240" w:lineRule="auto"/>
+        <w:ind w:left="288"/>
+      </w:pPr>
+      <w:r>
+        <w:rPr>
+          <w:rFonts w:ascii="Calibri" w:hAnsi="Calibri" w:eastAsia="Calibri" w:cs="Calibri"/>
+          <w:b w:val="0"/>
+          <w:color w:val="1A1A1A"/>
+          <w:sz w:val="21"/>
+        </w:rPr>
+        <w:t xml:space="preserve">Reduced feed scroll jank after profiling identified JS-thread stalls from long lists and full-resolution images; migrated lists to </w:t>
+      </w:r>
+      <w:r>
+        <w:rPr>
+          <w:rFonts w:ascii="Calibri" w:hAnsi="Calibri" w:eastAsia="Calibri" w:cs="Calibri"/>
+          <w:b/>
+          <w:color w:val="1A1A1A"/>
+          <w:sz w:val="21"/>
+        </w:rPr>
+        <w:t>FlashList</w:t>
+      </w:r>
+      <w:r>
+        <w:rPr>
+          <w:rFonts w:ascii="Calibri" w:hAnsi="Calibri" w:eastAsia="Calibri" w:cs="Calibri"/>
+          <w:b w:val="0"/>
+          <w:color w:val="1A1A1A"/>
+          <w:sz w:val="21"/>
+        </w:rPr>
+        <w:t xml:space="preserve"> with row memoization, cached and downscaled feed images, and ran </w:t>
+      </w:r>
+      <w:r>
+        <w:rPr>
+          <w:rFonts w:ascii="Calibri" w:hAnsi="Calibri" w:eastAsia="Calibri" w:cs="Calibri"/>
+          <w:b/>
+          <w:color w:val="1A1A1A"/>
+          <w:sz w:val="21"/>
+        </w:rPr>
+        <w:t>Reanimated</w:t>
+      </w:r>
+      <w:r>
+        <w:rPr>
+          <w:rFonts w:ascii="Calibri" w:hAnsi="Calibri" w:eastAsia="Calibri" w:cs="Calibri"/>
+          <w:b w:val="0"/>
+          <w:color w:val="1A1A1A"/>
+          <w:sz w:val="21"/>
+        </w:rPr>
+        <w:t xml:space="preserve"> transitions and gesture handlers on the native thread.</w:t>
       </w:r>
     </w:p>
     <w:p>
@@ -641,7 +1265,115 @@
           <w:color w:val="1A1A1A"/>
           <w:sz w:val="21"/>
         </w:rPr>
-        <w:t>Built shared design systems on Radix / Tailwind / shadcn/ui: themed with CSS tokens (color, type, space) instead of per-app hex, and exposed typed, reusable component APIs via React composition — compound components, Slot / children, and shared hooks — rather than prop-heavy leaf components. Storybook, Fumadocs, and MDX documented the contract; adoption across client apps eliminated duplicate UI.</w:t>
+        <w:t xml:space="preserve">Built shared </w:t>
+      </w:r>
+      <w:r>
+        <w:rPr>
+          <w:rFonts w:ascii="Calibri" w:hAnsi="Calibri" w:eastAsia="Calibri" w:cs="Calibri"/>
+          <w:b/>
+          <w:color w:val="1A1A1A"/>
+          <w:sz w:val="21"/>
+        </w:rPr>
+        <w:t>design systems</w:t>
+      </w:r>
+      <w:r>
+        <w:rPr>
+          <w:rFonts w:ascii="Calibri" w:hAnsi="Calibri" w:eastAsia="Calibri" w:cs="Calibri"/>
+          <w:b w:val="0"/>
+          <w:color w:val="1A1A1A"/>
+          <w:sz w:val="21"/>
+        </w:rPr>
+        <w:t xml:space="preserve"> on </w:t>
+      </w:r>
+      <w:r>
+        <w:rPr>
+          <w:rFonts w:ascii="Calibri" w:hAnsi="Calibri" w:eastAsia="Calibri" w:cs="Calibri"/>
+          <w:b/>
+          <w:color w:val="1A1A1A"/>
+          <w:sz w:val="21"/>
+        </w:rPr>
+        <w:t>Radix</w:t>
+      </w:r>
+      <w:r>
+        <w:rPr>
+          <w:rFonts w:ascii="Calibri" w:hAnsi="Calibri" w:eastAsia="Calibri" w:cs="Calibri"/>
+          <w:b w:val="0"/>
+          <w:color w:val="1A1A1A"/>
+          <w:sz w:val="21"/>
+        </w:rPr>
+        <w:t xml:space="preserve"> / </w:t>
+      </w:r>
+      <w:r>
+        <w:rPr>
+          <w:rFonts w:ascii="Calibri" w:hAnsi="Calibri" w:eastAsia="Calibri" w:cs="Calibri"/>
+          <w:b/>
+          <w:color w:val="1A1A1A"/>
+          <w:sz w:val="21"/>
+        </w:rPr>
+        <w:t>Tailwind</w:t>
+      </w:r>
+      <w:r>
+        <w:rPr>
+          <w:rFonts w:ascii="Calibri" w:hAnsi="Calibri" w:eastAsia="Calibri" w:cs="Calibri"/>
+          <w:b w:val="0"/>
+          <w:color w:val="1A1A1A"/>
+          <w:sz w:val="21"/>
+        </w:rPr>
+        <w:t xml:space="preserve"> / </w:t>
+      </w:r>
+      <w:r>
+        <w:rPr>
+          <w:rFonts w:ascii="Calibri" w:hAnsi="Calibri" w:eastAsia="Calibri" w:cs="Calibri"/>
+          <w:b/>
+          <w:color w:val="1A1A1A"/>
+          <w:sz w:val="21"/>
+        </w:rPr>
+        <w:t>shadcn/ui</w:t>
+      </w:r>
+      <w:r>
+        <w:rPr>
+          <w:rFonts w:ascii="Calibri" w:hAnsi="Calibri" w:eastAsia="Calibri" w:cs="Calibri"/>
+          <w:b w:val="0"/>
+          <w:color w:val="1A1A1A"/>
+          <w:sz w:val="21"/>
+        </w:rPr>
+        <w:t xml:space="preserve">: themed with CSS </w:t>
+      </w:r>
+      <w:r>
+        <w:rPr>
+          <w:rFonts w:ascii="Calibri" w:hAnsi="Calibri" w:eastAsia="Calibri" w:cs="Calibri"/>
+          <w:b/>
+          <w:color w:val="1A1A1A"/>
+          <w:sz w:val="21"/>
+        </w:rPr>
+        <w:t>tokens</w:t>
+      </w:r>
+      <w:r>
+        <w:rPr>
+          <w:rFonts w:ascii="Calibri" w:hAnsi="Calibri" w:eastAsia="Calibri" w:cs="Calibri"/>
+          <w:b w:val="0"/>
+          <w:color w:val="1A1A1A"/>
+          <w:sz w:val="21"/>
+        </w:rPr>
+        <w:t xml:space="preserve"> (color, type, space) instead of per-app hex, and exposed typed, reusable component APIs via React composition — compound components, Slot / children, and shared hooks — rather than prop-heavy leaf components. </w:t>
+      </w:r>
+      <w:r>
+        <w:rPr>
+          <w:rFonts w:ascii="Calibri" w:hAnsi="Calibri" w:eastAsia="Calibri" w:cs="Calibri"/>
+          <w:b/>
+          <w:color w:val="1A1A1A"/>
+          <w:sz w:val="21"/>
+        </w:rPr>
+        <w:t>Storybook</w:t>
+      </w:r>
+      <w:r>
+        <w:rPr>
+          <w:rFonts w:ascii="Calibri" w:hAnsi="Calibri" w:eastAsia="Calibri" w:cs="Calibri"/>
+          <w:b w:val="0"/>
+          <w:color w:val="1A1A1A"/>
+          <w:sz w:val="21"/>
+        </w:rPr>
+        <w:t>, Fumadocs, and MDX documented the contract; adoption across client apps eliminated duplicate UI.</w:t>
       </w:r>
     </w:p>
     <w:p>
@@ -657,7 +1389,61 @@
           <w:color w:val="1A1A1A"/>
           <w:sz w:val="21"/>
         </w:rPr>
-        <w:t>Established Vitest and Playwright / Cypress as quality gates for shared UI and the product flows using it.</w:t>
+        <w:t xml:space="preserve">Established </w:t>
+      </w:r>
+      <w:r>
+        <w:rPr>
+          <w:rFonts w:ascii="Calibri" w:hAnsi="Calibri" w:eastAsia="Calibri" w:cs="Calibri"/>
+          <w:b/>
+          <w:color w:val="1A1A1A"/>
+          <w:sz w:val="21"/>
+        </w:rPr>
+        <w:t>Vitest</w:t>
+      </w:r>
+      <w:r>
+        <w:rPr>
+          <w:rFonts w:ascii="Calibri" w:hAnsi="Calibri" w:eastAsia="Calibri" w:cs="Calibri"/>
+          <w:b w:val="0"/>
+          <w:color w:val="1A1A1A"/>
+          <w:sz w:val="21"/>
+        </w:rPr>
+        <w:t xml:space="preserve"> and </w:t>
+      </w:r>
+      <w:r>
+        <w:rPr>
+          <w:rFonts w:ascii="Calibri" w:hAnsi="Calibri" w:eastAsia="Calibri" w:cs="Calibri"/>
+          <w:b/>
+          <w:color w:val="1A1A1A"/>
+          <w:sz w:val="21"/>
+        </w:rPr>
+        <w:t>Playwright</w:t>
+      </w:r>
+      <w:r>
+        <w:rPr>
+          <w:rFonts w:ascii="Calibri" w:hAnsi="Calibri" w:eastAsia="Calibri" w:cs="Calibri"/>
+          <w:b w:val="0"/>
+          <w:color w:val="1A1A1A"/>
+          <w:sz w:val="21"/>
+        </w:rPr>
+        <w:t xml:space="preserve"> / </w:t>
+      </w:r>
+      <w:r>
+        <w:rPr>
+          <w:rFonts w:ascii="Calibri" w:hAnsi="Calibri" w:eastAsia="Calibri" w:cs="Calibri"/>
+          <w:b/>
+          <w:color w:val="1A1A1A"/>
+          <w:sz w:val="21"/>
+        </w:rPr>
+        <w:t>Cypress</w:t>
+      </w:r>
+      <w:r>
+        <w:rPr>
+          <w:rFonts w:ascii="Calibri" w:hAnsi="Calibri" w:eastAsia="Calibri" w:cs="Calibri"/>
+          <w:b w:val="0"/>
+          <w:color w:val="1A1A1A"/>
+          <w:sz w:val="21"/>
+        </w:rPr>
+        <w:t xml:space="preserve"> as quality gates for shared UI and the product flows using it.</w:t>
       </w:r>
     </w:p>
     <w:p>
@@ -673,7 +1459,25 @@
           <w:color w:val="1A1A1A"/>
           <w:sz w:val="21"/>
         </w:rPr>
-        <w:t>Instrumented client web and mobile apps and their APIs with Sentry, making production crashes, device issues, and API errors visible after release.</w:t>
+        <w:t xml:space="preserve">Instrumented client web and mobile apps and their APIs with </w:t>
+      </w:r>
+      <w:r>
+        <w:rPr>
+          <w:rFonts w:ascii="Calibri" w:hAnsi="Calibri" w:eastAsia="Calibri" w:cs="Calibri"/>
+          <w:b/>
+          <w:color w:val="1A1A1A"/>
+          <w:sz w:val="21"/>
+        </w:rPr>
+        <w:t>Sentry</w:t>
+      </w:r>
+      <w:r>
+        <w:rPr>
+          <w:rFonts w:ascii="Calibri" w:hAnsi="Calibri" w:eastAsia="Calibri" w:cs="Calibri"/>
+          <w:b w:val="0"/>
+          <w:color w:val="1A1A1A"/>
+          <w:sz w:val="21"/>
+        </w:rPr>
+        <w:t>, making production crashes, device issues, and API errors visible after release.</w:t>
       </w:r>
     </w:p>
     <w:p>
@@ -689,7 +1493,43 @@
           <w:color w:val="1A1A1A"/>
           <w:sz w:val="21"/>
         </w:rPr>
-        <w:t>Led adoption of tRPC and Scalar-generated API documentation, cutting API integration time by 50% and eliminating schema-mismatch errors that blocked product work.</w:t>
+        <w:t xml:space="preserve">Led adoption of </w:t>
+      </w:r>
+      <w:r>
+        <w:rPr>
+          <w:rFonts w:ascii="Calibri" w:hAnsi="Calibri" w:eastAsia="Calibri" w:cs="Calibri"/>
+          <w:b/>
+          <w:color w:val="1A1A1A"/>
+          <w:sz w:val="21"/>
+        </w:rPr>
+        <w:t>tRPC</w:t>
+      </w:r>
+      <w:r>
+        <w:rPr>
+          <w:rFonts w:ascii="Calibri" w:hAnsi="Calibri" w:eastAsia="Calibri" w:cs="Calibri"/>
+          <w:b w:val="0"/>
+          <w:color w:val="1A1A1A"/>
+          <w:sz w:val="21"/>
+        </w:rPr>
+        <w:t xml:space="preserve"> and Scalar-generated API documentation, cutting API integration time by </w:t>
+      </w:r>
+      <w:r>
+        <w:rPr>
+          <w:rFonts w:ascii="Calibri" w:hAnsi="Calibri" w:eastAsia="Calibri" w:cs="Calibri"/>
+          <w:b/>
+          <w:color w:val="1A1A1A"/>
+          <w:sz w:val="21"/>
+        </w:rPr>
+        <w:t>50%</w:t>
+      </w:r>
+      <w:r>
+        <w:rPr>
+          <w:rFonts w:ascii="Calibri" w:hAnsi="Calibri" w:eastAsia="Calibri" w:cs="Calibri"/>
+          <w:b w:val="0"/>
+          <w:color w:val="1A1A1A"/>
+          <w:sz w:val="21"/>
+        </w:rPr>
+        <w:t xml:space="preserve"> and eliminating schema-mismatch errors that blocked product work.</w:t>
       </w:r>
     </w:p>
     <w:p>
@@ -705,7 +1545,115 @@
           <w:color w:val="1A1A1A"/>
           <w:sz w:val="21"/>
         </w:rPr>
-        <w:t>Replaced WordPress across client sites with headless CMS platforms (Strapi / Sanity) and unified search (Meilisearch / Algolia) on Next.js; cut load times by 80% and search latency by 90%, and achieved PageSpeed Insights scores above 95.</w:t>
+        <w:t xml:space="preserve">Replaced WordPress across client sites with </w:t>
+      </w:r>
+      <w:r>
+        <w:rPr>
+          <w:rFonts w:ascii="Calibri" w:hAnsi="Calibri" w:eastAsia="Calibri" w:cs="Calibri"/>
+          <w:b/>
+          <w:color w:val="1A1A1A"/>
+          <w:sz w:val="21"/>
+        </w:rPr>
+        <w:t>headless CMS</w:t>
+      </w:r>
+      <w:r>
+        <w:rPr>
+          <w:rFonts w:ascii="Calibri" w:hAnsi="Calibri" w:eastAsia="Calibri" w:cs="Calibri"/>
+          <w:b w:val="0"/>
+          <w:color w:val="1A1A1A"/>
+          <w:sz w:val="21"/>
+        </w:rPr>
+        <w:t xml:space="preserve"> platforms (Strapi / Sanity) and </w:t>
+      </w:r>
+      <w:r>
+        <w:rPr>
+          <w:rFonts w:ascii="Calibri" w:hAnsi="Calibri" w:eastAsia="Calibri" w:cs="Calibri"/>
+          <w:b/>
+          <w:color w:val="1A1A1A"/>
+          <w:sz w:val="21"/>
+        </w:rPr>
+        <w:t>unified search</w:t>
+      </w:r>
+      <w:r>
+        <w:rPr>
+          <w:rFonts w:ascii="Calibri" w:hAnsi="Calibri" w:eastAsia="Calibri" w:cs="Calibri"/>
+          <w:b w:val="0"/>
+          <w:color w:val="1A1A1A"/>
+          <w:sz w:val="21"/>
+        </w:rPr>
+        <w:t xml:space="preserve"> (Meilisearch / Algolia) on </w:t>
+      </w:r>
+      <w:r>
+        <w:rPr>
+          <w:rFonts w:ascii="Calibri" w:hAnsi="Calibri" w:eastAsia="Calibri" w:cs="Calibri"/>
+          <w:b/>
+          <w:color w:val="1A1A1A"/>
+          <w:sz w:val="21"/>
+        </w:rPr>
+        <w:t>Next.js</w:t>
+      </w:r>
+      <w:r>
+        <w:rPr>
+          <w:rFonts w:ascii="Calibri" w:hAnsi="Calibri" w:eastAsia="Calibri" w:cs="Calibri"/>
+          <w:b w:val="0"/>
+          <w:color w:val="1A1A1A"/>
+          <w:sz w:val="21"/>
+        </w:rPr>
+        <w:t xml:space="preserve">; cut load times by </w:t>
+      </w:r>
+      <w:r>
+        <w:rPr>
+          <w:rFonts w:ascii="Calibri" w:hAnsi="Calibri" w:eastAsia="Calibri" w:cs="Calibri"/>
+          <w:b/>
+          <w:color w:val="1A1A1A"/>
+          <w:sz w:val="21"/>
+        </w:rPr>
+        <w:t>80%</w:t>
+      </w:r>
+      <w:r>
+        <w:rPr>
+          <w:rFonts w:ascii="Calibri" w:hAnsi="Calibri" w:eastAsia="Calibri" w:cs="Calibri"/>
+          <w:b w:val="0"/>
+          <w:color w:val="1A1A1A"/>
+          <w:sz w:val="21"/>
+        </w:rPr>
+        <w:t xml:space="preserve"> and search latency by </w:t>
+      </w:r>
+      <w:r>
+        <w:rPr>
+          <w:rFonts w:ascii="Calibri" w:hAnsi="Calibri" w:eastAsia="Calibri" w:cs="Calibri"/>
+          <w:b/>
+          <w:color w:val="1A1A1A"/>
+          <w:sz w:val="21"/>
+        </w:rPr>
+        <w:t>90%</w:t>
+      </w:r>
+      <w:r>
+        <w:rPr>
+          <w:rFonts w:ascii="Calibri" w:hAnsi="Calibri" w:eastAsia="Calibri" w:cs="Calibri"/>
+          <w:b w:val="0"/>
+          <w:color w:val="1A1A1A"/>
+          <w:sz w:val="21"/>
+        </w:rPr>
+        <w:t xml:space="preserve">, and achieved PageSpeed Insights scores above </w:t>
+      </w:r>
+      <w:r>
+        <w:rPr>
+          <w:rFonts w:ascii="Calibri" w:hAnsi="Calibri" w:eastAsia="Calibri" w:cs="Calibri"/>
+          <w:b/>
+          <w:color w:val="1A1A1A"/>
+          <w:sz w:val="21"/>
+        </w:rPr>
+        <w:t>95</w:t>
+      </w:r>
+      <w:r>
+        <w:rPr>
+          <w:rFonts w:ascii="Calibri" w:hAnsi="Calibri" w:eastAsia="Calibri" w:cs="Calibri"/>
+          <w:b w:val="0"/>
+          <w:color w:val="1A1A1A"/>
+          <w:sz w:val="21"/>
+        </w:rPr>
+        <w:t>.</w:t>
       </w:r>
     </w:p>
     <w:p>
@@ -753,7 +1701,27 @@
           <w:color w:val="1A1A1A"/>
           <w:sz w:val="21"/>
         </w:rPr>
-        <w:t>Also shipped restaurant loyalty/student/membership apps (React Native), a homebound elderly care app (Flutter), campaign / e-commerce storefronts (Next.js, Shopify GraphQL), and CMS content sites.</w:t>
+        <w:t xml:space="preserve">Also shipped restaurant loyalty/student/membership apps (React Native), a homebound elderly care app (Flutter), campaign / e-commerce storefronts (Next.js, Shopify </w:t>
+      </w:r>
+      <w:r>
+        <w:rPr>
+          <w:rFonts w:ascii="Calibri" w:hAnsi="Calibri" w:eastAsia="Calibri" w:cs="Calibri"/>
+          <w:b/>
+          <w:i w:val="0"/>
+          <w:color w:val="1A1A1A"/>
+          <w:sz w:val="21"/>
+        </w:rPr>
+        <w:t>GraphQL</w:t>
+      </w:r>
+      <w:r>
+        <w:rPr>
+          <w:rFonts w:ascii="Calibri" w:hAnsi="Calibri" w:eastAsia="Calibri" w:cs="Calibri"/>
+          <w:b w:val="0"/>
+          <w:i w:val="0"/>
+          <w:color w:val="1A1A1A"/>
+          <w:sz w:val="21"/>
+        </w:rPr>
+        <w:t>), and CMS content sites.</w:t>
       </w:r>
     </w:p>
     <w:p>

</xml_diff>

<commit_message>
Update resume files and enhance content for improved clarity and accessibility
- Updated the PDF and DOCX resume files for "frontend" and "full-stack" variants to the latest versions.
- Enhanced the content in the resume documentation, adding details on design systems, performance optimizations, and project highlights.
- Improved web accessibility features and ensured semantic structure in the resume layout.
- Cached static assets to reduce latency and improve SEO performance.
</commit_message>
<xml_diff>
--- a/apps/web/src/features/resume/wilsonchow_resume_v4_frontend.docx
+++ b/apps/web/src/features/resume/wilsonchow_resume_v4_frontend.docx
@@ -190,6 +190,461 @@
     </w:p>
     <w:p>
       <w:pPr>
+        <w:pStyle w:val="ListBullet"/>
+        <w:spacing w:before="0" w:after="30" w:line="240" w:lineRule="auto"/>
+        <w:ind w:left="288"/>
+      </w:pPr>
+      <w:r>
+        <w:rPr>
+          <w:rFonts w:ascii="Calibri" w:hAnsi="Calibri" w:eastAsia="Calibri" w:cs="Calibri"/>
+          <w:b w:val="0"/>
+          <w:color w:val="1A1A1A"/>
+          <w:sz w:val="21"/>
+        </w:rPr>
+        <w:t xml:space="preserve">Built </w:t>
+      </w:r>
+      <w:r>
+        <w:rPr>
+          <w:rFonts w:ascii="Calibri" w:hAnsi="Calibri" w:eastAsia="Calibri" w:cs="Calibri"/>
+          <w:b/>
+          <w:color w:val="1A1A1A"/>
+          <w:sz w:val="21"/>
+        </w:rPr>
+        <w:t>design systems</w:t>
+      </w:r>
+      <w:r>
+        <w:rPr>
+          <w:rFonts w:ascii="Calibri" w:hAnsi="Calibri" w:eastAsia="Calibri" w:cs="Calibri"/>
+          <w:b w:val="0"/>
+          <w:color w:val="1A1A1A"/>
+          <w:sz w:val="21"/>
+        </w:rPr>
+        <w:t xml:space="preserve"> on </w:t>
+      </w:r>
+      <w:r>
+        <w:rPr>
+          <w:rFonts w:ascii="Calibri" w:hAnsi="Calibri" w:eastAsia="Calibri" w:cs="Calibri"/>
+          <w:b/>
+          <w:color w:val="1A1A1A"/>
+          <w:sz w:val="21"/>
+        </w:rPr>
+        <w:t>Radix</w:t>
+      </w:r>
+      <w:r>
+        <w:rPr>
+          <w:rFonts w:ascii="Calibri" w:hAnsi="Calibri" w:eastAsia="Calibri" w:cs="Calibri"/>
+          <w:b w:val="0"/>
+          <w:color w:val="1A1A1A"/>
+          <w:sz w:val="21"/>
+        </w:rPr>
+        <w:t xml:space="preserve"> / </w:t>
+      </w:r>
+      <w:r>
+        <w:rPr>
+          <w:rFonts w:ascii="Calibri" w:hAnsi="Calibri" w:eastAsia="Calibri" w:cs="Calibri"/>
+          <w:b/>
+          <w:color w:val="1A1A1A"/>
+          <w:sz w:val="21"/>
+        </w:rPr>
+        <w:t>Tailwind</w:t>
+      </w:r>
+      <w:r>
+        <w:rPr>
+          <w:rFonts w:ascii="Calibri" w:hAnsi="Calibri" w:eastAsia="Calibri" w:cs="Calibri"/>
+          <w:b w:val="0"/>
+          <w:color w:val="1A1A1A"/>
+          <w:sz w:val="21"/>
+        </w:rPr>
+        <w:t xml:space="preserve"> / </w:t>
+      </w:r>
+      <w:r>
+        <w:rPr>
+          <w:rFonts w:ascii="Calibri" w:hAnsi="Calibri" w:eastAsia="Calibri" w:cs="Calibri"/>
+          <w:b/>
+          <w:color w:val="1A1A1A"/>
+          <w:sz w:val="21"/>
+        </w:rPr>
+        <w:t>shadcn/ui</w:t>
+      </w:r>
+      <w:r>
+        <w:rPr>
+          <w:rFonts w:ascii="Calibri" w:hAnsi="Calibri" w:eastAsia="Calibri" w:cs="Calibri"/>
+          <w:b w:val="0"/>
+          <w:color w:val="1A1A1A"/>
+          <w:sz w:val="21"/>
+        </w:rPr>
+        <w:t xml:space="preserve">: themed with CSS </w:t>
+      </w:r>
+      <w:r>
+        <w:rPr>
+          <w:rFonts w:ascii="Calibri" w:hAnsi="Calibri" w:eastAsia="Calibri" w:cs="Calibri"/>
+          <w:b/>
+          <w:color w:val="1A1A1A"/>
+          <w:sz w:val="21"/>
+        </w:rPr>
+        <w:t>tokens</w:t>
+      </w:r>
+      <w:r>
+        <w:rPr>
+          <w:rFonts w:ascii="Calibri" w:hAnsi="Calibri" w:eastAsia="Calibri" w:cs="Calibri"/>
+          <w:b w:val="0"/>
+          <w:color w:val="1A1A1A"/>
+          <w:sz w:val="21"/>
+        </w:rPr>
+        <w:t xml:space="preserve"> (color, type, space); Built composable components and shared hooks. Documented with </w:t>
+      </w:r>
+      <w:r>
+        <w:rPr>
+          <w:rFonts w:ascii="Calibri" w:hAnsi="Calibri" w:eastAsia="Calibri" w:cs="Calibri"/>
+          <w:b/>
+          <w:color w:val="1A1A1A"/>
+          <w:sz w:val="21"/>
+        </w:rPr>
+        <w:t>Storybook</w:t>
+      </w:r>
+      <w:r>
+        <w:rPr>
+          <w:rFonts w:ascii="Calibri" w:hAnsi="Calibri" w:eastAsia="Calibri" w:cs="Calibri"/>
+          <w:b w:val="0"/>
+          <w:color w:val="1A1A1A"/>
+          <w:sz w:val="21"/>
+        </w:rPr>
+        <w:t xml:space="preserve">, </w:t>
+      </w:r>
+      <w:r>
+        <w:rPr>
+          <w:rFonts w:ascii="Calibri" w:hAnsi="Calibri" w:eastAsia="Calibri" w:cs="Calibri"/>
+          <w:b/>
+          <w:color w:val="1A1A1A"/>
+          <w:sz w:val="21"/>
+        </w:rPr>
+        <w:t>Fumadocs</w:t>
+      </w:r>
+      <w:r>
+        <w:rPr>
+          <w:rFonts w:ascii="Calibri" w:hAnsi="Calibri" w:eastAsia="Calibri" w:cs="Calibri"/>
+          <w:b w:val="0"/>
+          <w:color w:val="1A1A1A"/>
+          <w:sz w:val="21"/>
+        </w:rPr>
+        <w:t>, MDX.</w:t>
+      </w:r>
+    </w:p>
+    <w:p>
+      <w:pPr>
+        <w:pStyle w:val="ListBullet"/>
+        <w:spacing w:before="0" w:after="30" w:line="240" w:lineRule="auto"/>
+        <w:ind w:left="288"/>
+      </w:pPr>
+      <w:r>
+        <w:rPr>
+          <w:rFonts w:ascii="Calibri" w:hAnsi="Calibri" w:eastAsia="Calibri" w:cs="Calibri"/>
+          <w:b w:val="0"/>
+          <w:color w:val="1A1A1A"/>
+          <w:sz w:val="21"/>
+        </w:rPr>
+        <w:t xml:space="preserve">Migrated WordPress across client sites to </w:t>
+      </w:r>
+      <w:r>
+        <w:rPr>
+          <w:rFonts w:ascii="Calibri" w:hAnsi="Calibri" w:eastAsia="Calibri" w:cs="Calibri"/>
+          <w:b/>
+          <w:color w:val="1A1A1A"/>
+          <w:sz w:val="21"/>
+        </w:rPr>
+        <w:t>headless CMS</w:t>
+      </w:r>
+      <w:r>
+        <w:rPr>
+          <w:rFonts w:ascii="Calibri" w:hAnsi="Calibri" w:eastAsia="Calibri" w:cs="Calibri"/>
+          <w:b w:val="0"/>
+          <w:color w:val="1A1A1A"/>
+          <w:sz w:val="21"/>
+        </w:rPr>
+        <w:t xml:space="preserve"> platforms (Strapi / Sanity) and </w:t>
+      </w:r>
+      <w:r>
+        <w:rPr>
+          <w:rFonts w:ascii="Calibri" w:hAnsi="Calibri" w:eastAsia="Calibri" w:cs="Calibri"/>
+          <w:b/>
+          <w:color w:val="1A1A1A"/>
+          <w:sz w:val="21"/>
+        </w:rPr>
+        <w:t>unified search</w:t>
+      </w:r>
+      <w:r>
+        <w:rPr>
+          <w:rFonts w:ascii="Calibri" w:hAnsi="Calibri" w:eastAsia="Calibri" w:cs="Calibri"/>
+          <w:b w:val="0"/>
+          <w:color w:val="1A1A1A"/>
+          <w:sz w:val="21"/>
+        </w:rPr>
+        <w:t xml:space="preserve"> (Meilisearch / Algolia) on </w:t>
+      </w:r>
+      <w:r>
+        <w:rPr>
+          <w:rFonts w:ascii="Calibri" w:hAnsi="Calibri" w:eastAsia="Calibri" w:cs="Calibri"/>
+          <w:b/>
+          <w:color w:val="1A1A1A"/>
+          <w:sz w:val="21"/>
+        </w:rPr>
+        <w:t>Next.js</w:t>
+      </w:r>
+      <w:r>
+        <w:rPr>
+          <w:rFonts w:ascii="Calibri" w:hAnsi="Calibri" w:eastAsia="Calibri" w:cs="Calibri"/>
+          <w:b w:val="0"/>
+          <w:color w:val="1A1A1A"/>
+          <w:sz w:val="21"/>
+        </w:rPr>
+        <w:t xml:space="preserve">; cut load times by </w:t>
+      </w:r>
+      <w:r>
+        <w:rPr>
+          <w:rFonts w:ascii="Calibri" w:hAnsi="Calibri" w:eastAsia="Calibri" w:cs="Calibri"/>
+          <w:b/>
+          <w:color w:val="1A1A1A"/>
+          <w:sz w:val="21"/>
+        </w:rPr>
+        <w:t>80%</w:t>
+      </w:r>
+      <w:r>
+        <w:rPr>
+          <w:rFonts w:ascii="Calibri" w:hAnsi="Calibri" w:eastAsia="Calibri" w:cs="Calibri"/>
+          <w:b w:val="0"/>
+          <w:color w:val="1A1A1A"/>
+          <w:sz w:val="21"/>
+        </w:rPr>
+        <w:t xml:space="preserve"> and search latency by </w:t>
+      </w:r>
+      <w:r>
+        <w:rPr>
+          <w:rFonts w:ascii="Calibri" w:hAnsi="Calibri" w:eastAsia="Calibri" w:cs="Calibri"/>
+          <w:b/>
+          <w:color w:val="1A1A1A"/>
+          <w:sz w:val="21"/>
+        </w:rPr>
+        <w:t>90%</w:t>
+      </w:r>
+      <w:r>
+        <w:rPr>
+          <w:rFonts w:ascii="Calibri" w:hAnsi="Calibri" w:eastAsia="Calibri" w:cs="Calibri"/>
+          <w:b w:val="0"/>
+          <w:color w:val="1A1A1A"/>
+          <w:sz w:val="21"/>
+        </w:rPr>
+        <w:t xml:space="preserve">, and achieved PageSpeed Insights scores above </w:t>
+      </w:r>
+      <w:r>
+        <w:rPr>
+          <w:rFonts w:ascii="Calibri" w:hAnsi="Calibri" w:eastAsia="Calibri" w:cs="Calibri"/>
+          <w:b/>
+          <w:color w:val="1A1A1A"/>
+          <w:sz w:val="21"/>
+        </w:rPr>
+        <w:t>95</w:t>
+      </w:r>
+      <w:r>
+        <w:rPr>
+          <w:rFonts w:ascii="Calibri" w:hAnsi="Calibri" w:eastAsia="Calibri" w:cs="Calibri"/>
+          <w:b w:val="0"/>
+          <w:color w:val="1A1A1A"/>
+          <w:sz w:val="21"/>
+        </w:rPr>
+        <w:t>.</w:t>
+      </w:r>
+    </w:p>
+    <w:p>
+      <w:pPr>
+        <w:pStyle w:val="ListBullet"/>
+        <w:spacing w:before="0" w:after="30" w:line="240" w:lineRule="auto"/>
+        <w:ind w:left="288"/>
+      </w:pPr>
+      <w:r>
+        <w:rPr>
+          <w:rFonts w:ascii="Calibri" w:hAnsi="Calibri" w:eastAsia="Calibri" w:cs="Calibri"/>
+          <w:b w:val="0"/>
+          <w:color w:val="1A1A1A"/>
+          <w:sz w:val="21"/>
+        </w:rPr>
+        <w:t xml:space="preserve">Established </w:t>
+      </w:r>
+      <w:r>
+        <w:rPr>
+          <w:rFonts w:ascii="Calibri" w:hAnsi="Calibri" w:eastAsia="Calibri" w:cs="Calibri"/>
+          <w:b/>
+          <w:color w:val="1A1A1A"/>
+          <w:sz w:val="21"/>
+        </w:rPr>
+        <w:t>Vitest</w:t>
+      </w:r>
+      <w:r>
+        <w:rPr>
+          <w:rFonts w:ascii="Calibri" w:hAnsi="Calibri" w:eastAsia="Calibri" w:cs="Calibri"/>
+          <w:b w:val="0"/>
+          <w:color w:val="1A1A1A"/>
+          <w:sz w:val="21"/>
+        </w:rPr>
+        <w:t xml:space="preserve"> and </w:t>
+      </w:r>
+      <w:r>
+        <w:rPr>
+          <w:rFonts w:ascii="Calibri" w:hAnsi="Calibri" w:eastAsia="Calibri" w:cs="Calibri"/>
+          <w:b/>
+          <w:color w:val="1A1A1A"/>
+          <w:sz w:val="21"/>
+        </w:rPr>
+        <w:t>Playwright</w:t>
+      </w:r>
+      <w:r>
+        <w:rPr>
+          <w:rFonts w:ascii="Calibri" w:hAnsi="Calibri" w:eastAsia="Calibri" w:cs="Calibri"/>
+          <w:b w:val="0"/>
+          <w:color w:val="1A1A1A"/>
+          <w:sz w:val="21"/>
+        </w:rPr>
+        <w:t xml:space="preserve"> / </w:t>
+      </w:r>
+      <w:r>
+        <w:rPr>
+          <w:rFonts w:ascii="Calibri" w:hAnsi="Calibri" w:eastAsia="Calibri" w:cs="Calibri"/>
+          <w:b/>
+          <w:color w:val="1A1A1A"/>
+          <w:sz w:val="21"/>
+        </w:rPr>
+        <w:t>Cypress</w:t>
+      </w:r>
+      <w:r>
+        <w:rPr>
+          <w:rFonts w:ascii="Calibri" w:hAnsi="Calibri" w:eastAsia="Calibri" w:cs="Calibri"/>
+          <w:b w:val="0"/>
+          <w:color w:val="1A1A1A"/>
+          <w:sz w:val="21"/>
+        </w:rPr>
+        <w:t xml:space="preserve"> as quality gates for shared UI and the product flows using it.</w:t>
+      </w:r>
+    </w:p>
+    <w:p>
+      <w:pPr>
+        <w:pStyle w:val="ListBullet"/>
+        <w:spacing w:before="0" w:after="30" w:line="240" w:lineRule="auto"/>
+        <w:ind w:left="288"/>
+      </w:pPr>
+      <w:r>
+        <w:rPr>
+          <w:rFonts w:ascii="Calibri" w:hAnsi="Calibri" w:eastAsia="Calibri" w:cs="Calibri"/>
+          <w:b w:val="0"/>
+          <w:color w:val="1A1A1A"/>
+          <w:sz w:val="21"/>
+        </w:rPr>
+        <w:t xml:space="preserve">Instrumented client web and mobile apps and their APIs with </w:t>
+      </w:r>
+      <w:r>
+        <w:rPr>
+          <w:rFonts w:ascii="Calibri" w:hAnsi="Calibri" w:eastAsia="Calibri" w:cs="Calibri"/>
+          <w:b/>
+          <w:color w:val="1A1A1A"/>
+          <w:sz w:val="21"/>
+        </w:rPr>
+        <w:t>Sentry</w:t>
+      </w:r>
+      <w:r>
+        <w:rPr>
+          <w:rFonts w:ascii="Calibri" w:hAnsi="Calibri" w:eastAsia="Calibri" w:cs="Calibri"/>
+          <w:b w:val="0"/>
+          <w:color w:val="1A1A1A"/>
+          <w:sz w:val="21"/>
+        </w:rPr>
+        <w:t>, making production crashes, device issues, and API errors visible after release.</w:t>
+      </w:r>
+    </w:p>
+    <w:p>
+      <w:pPr>
+        <w:pStyle w:val="ListBullet"/>
+        <w:spacing w:before="0" w:after="30" w:line="240" w:lineRule="auto"/>
+        <w:ind w:left="288"/>
+      </w:pPr>
+      <w:r>
+        <w:rPr>
+          <w:rFonts w:ascii="Calibri" w:hAnsi="Calibri" w:eastAsia="Calibri" w:cs="Calibri"/>
+          <w:b w:val="0"/>
+          <w:color w:val="1A1A1A"/>
+          <w:sz w:val="21"/>
+        </w:rPr>
+        <w:t xml:space="preserve">Led adoption of </w:t>
+      </w:r>
+      <w:r>
+        <w:rPr>
+          <w:rFonts w:ascii="Calibri" w:hAnsi="Calibri" w:eastAsia="Calibri" w:cs="Calibri"/>
+          <w:b/>
+          <w:color w:val="1A1A1A"/>
+          <w:sz w:val="21"/>
+        </w:rPr>
+        <w:t>tRPC</w:t>
+      </w:r>
+      <w:r>
+        <w:rPr>
+          <w:rFonts w:ascii="Calibri" w:hAnsi="Calibri" w:eastAsia="Calibri" w:cs="Calibri"/>
+          <w:b w:val="0"/>
+          <w:color w:val="1A1A1A"/>
+          <w:sz w:val="21"/>
+        </w:rPr>
+        <w:t xml:space="preserve"> and Scalar-generated API documentation, cutting API integration time by </w:t>
+      </w:r>
+      <w:r>
+        <w:rPr>
+          <w:rFonts w:ascii="Calibri" w:hAnsi="Calibri" w:eastAsia="Calibri" w:cs="Calibri"/>
+          <w:b/>
+          <w:color w:val="1A1A1A"/>
+          <w:sz w:val="21"/>
+        </w:rPr>
+        <w:t>50%</w:t>
+      </w:r>
+      <w:r>
+        <w:rPr>
+          <w:rFonts w:ascii="Calibri" w:hAnsi="Calibri" w:eastAsia="Calibri" w:cs="Calibri"/>
+          <w:b w:val="0"/>
+          <w:color w:val="1A1A1A"/>
+          <w:sz w:val="21"/>
+        </w:rPr>
+        <w:t xml:space="preserve"> and eliminating schema-mismatch errors that blocked product work.</w:t>
+      </w:r>
+    </w:p>
+    <w:p>
+      <w:pPr>
+        <w:pStyle w:val="ListBullet"/>
+        <w:spacing w:before="0" w:after="30" w:line="240" w:lineRule="auto"/>
+        <w:ind w:left="288"/>
+      </w:pPr>
+      <w:r>
+        <w:rPr>
+          <w:rFonts w:ascii="Calibri" w:hAnsi="Calibri" w:eastAsia="Calibri" w:cs="Calibri"/>
+          <w:b w:val="0"/>
+          <w:color w:val="1A1A1A"/>
+          <w:sz w:val="21"/>
+        </w:rPr>
+        <w:t>Mentored summer interns and junior developers through pair programming, code reviews, and guidance as they shipped production UI.</w:t>
+      </w:r>
+    </w:p>
+    <w:p>
+      <w:pPr>
+        <w:spacing w:before="200" w:after="80" w:line="240" w:lineRule="auto"/>
+        <w:pBdr>
+          <w:bottom w:val="single" w:sz="12" w:space="1" w:color="2C2C2C"/>
+        </w:pBdr>
+      </w:pPr>
+      <w:r>
+        <w:rPr>
+          <w:rFonts w:ascii="Calibri" w:hAnsi="Calibri" w:eastAsia="Calibri" w:cs="Calibri"/>
+          <w:b/>
+          <w:color w:val="2C2C2C"/>
+          <w:sz w:val="22"/>
+        </w:rPr>
+        <w:t>SELECTED PROJECTS</w:t>
+      </w:r>
+    </w:p>
+    <w:p>
+      <w:pPr>
         <w:tabs>
           <w:tab w:pos="10224" w:val="right"/>
         </w:tabs>
@@ -348,7 +803,61 @@
           <w:color w:val="1A1A1A"/>
           <w:sz w:val="21"/>
         </w:rPr>
-        <w:t>Built an admin form builder with conditional logic and ran those questionnaires in-thread, so product recommendations and cart actions never left the conversation.</w:t>
+        <w:t xml:space="preserve">Built an admin form builder with conditional logic, modeled with </w:t>
+      </w:r>
+      <w:r>
+        <w:rPr>
+          <w:rFonts w:ascii="Calibri" w:hAnsi="Calibri" w:eastAsia="Calibri" w:cs="Calibri"/>
+          <w:b/>
+          <w:color w:val="1A1A1A"/>
+          <w:sz w:val="21"/>
+        </w:rPr>
+        <w:t>React Hook Form</w:t>
+      </w:r>
+      <w:r>
+        <w:rPr>
+          <w:rFonts w:ascii="Calibri" w:hAnsi="Calibri" w:eastAsia="Calibri" w:cs="Calibri"/>
+          <w:b w:val="0"/>
+          <w:color w:val="1A1A1A"/>
+          <w:sz w:val="21"/>
+        </w:rPr>
+        <w:t xml:space="preserve">, </w:t>
+      </w:r>
+      <w:r>
+        <w:rPr>
+          <w:rFonts w:ascii="Calibri" w:hAnsi="Calibri" w:eastAsia="Calibri" w:cs="Calibri"/>
+          <w:b/>
+          <w:color w:val="1A1A1A"/>
+          <w:sz w:val="21"/>
+        </w:rPr>
+        <w:t>Zod</w:t>
+      </w:r>
+      <w:r>
+        <w:rPr>
+          <w:rFonts w:ascii="Calibri" w:hAnsi="Calibri" w:eastAsia="Calibri" w:cs="Calibri"/>
+          <w:b w:val="0"/>
+          <w:color w:val="1A1A1A"/>
+          <w:sz w:val="21"/>
+        </w:rPr>
+        <w:t xml:space="preserve"> and </w:t>
+      </w:r>
+      <w:r>
+        <w:rPr>
+          <w:rFonts w:ascii="Calibri" w:hAnsi="Calibri" w:eastAsia="Calibri" w:cs="Calibri"/>
+          <w:b/>
+          <w:color w:val="1A1A1A"/>
+          <w:sz w:val="21"/>
+        </w:rPr>
+        <w:t>XState</w:t>
+      </w:r>
+      <w:r>
+        <w:rPr>
+          <w:rFonts w:ascii="Calibri" w:hAnsi="Calibri" w:eastAsia="Calibri" w:cs="Calibri"/>
+          <w:b w:val="0"/>
+          <w:color w:val="1A1A1A"/>
+          <w:sz w:val="21"/>
+        </w:rPr>
+        <w:t>.</w:t>
       </w:r>
     </w:p>
     <w:p>
@@ -453,76 +962,6 @@
           <w:sz w:val="21"/>
         </w:rPr>
         <w:t xml:space="preserve"> with pagination, filters, and sorting; stored table state in URL search parameters so lists stay shareable and bookmarkable.</w:t>
-      </w:r>
-    </w:p>
-    <w:p>
-      <w:pPr>
-        <w:pStyle w:val="ListBullet"/>
-        <w:spacing w:before="0" w:after="30" w:line="240" w:lineRule="auto"/>
-        <w:ind w:left="288"/>
-      </w:pPr>
-      <w:r>
-        <w:rPr>
-          <w:rFonts w:ascii="Calibri" w:hAnsi="Calibri" w:eastAsia="Calibri" w:cs="Calibri"/>
-          <w:b w:val="0"/>
-          <w:color w:val="1A1A1A"/>
-          <w:sz w:val="21"/>
-        </w:rPr>
-        <w:t xml:space="preserve">Modeled multi-step health questionnaires with </w:t>
-      </w:r>
-      <w:r>
-        <w:rPr>
-          <w:rFonts w:ascii="Calibri" w:hAnsi="Calibri" w:eastAsia="Calibri" w:cs="Calibri"/>
-          <w:b/>
-          <w:color w:val="1A1A1A"/>
-          <w:sz w:val="21"/>
-        </w:rPr>
-        <w:t>XState</w:t>
-      </w:r>
-      <w:r>
-        <w:rPr>
-          <w:rFonts w:ascii="Calibri" w:hAnsi="Calibri" w:eastAsia="Calibri" w:cs="Calibri"/>
-          <w:b w:val="0"/>
-          <w:color w:val="1A1A1A"/>
-          <w:sz w:val="21"/>
-        </w:rPr>
-        <w:t xml:space="preserve"> and </w:t>
-      </w:r>
-      <w:r>
-        <w:rPr>
-          <w:rFonts w:ascii="Calibri" w:hAnsi="Calibri" w:eastAsia="Calibri" w:cs="Calibri"/>
-          <w:b/>
-          <w:color w:val="1A1A1A"/>
-          <w:sz w:val="21"/>
-        </w:rPr>
-        <w:t>React Hook Form</w:t>
-      </w:r>
-      <w:r>
-        <w:rPr>
-          <w:rFonts w:ascii="Calibri" w:hAnsi="Calibri" w:eastAsia="Calibri" w:cs="Calibri"/>
-          <w:b w:val="0"/>
-          <w:color w:val="1A1A1A"/>
-          <w:sz w:val="21"/>
-        </w:rPr>
-        <w:t xml:space="preserve"> / </w:t>
-      </w:r>
-      <w:r>
-        <w:rPr>
-          <w:rFonts w:ascii="Calibri" w:hAnsi="Calibri" w:eastAsia="Calibri" w:cs="Calibri"/>
-          <w:b/>
-          <w:color w:val="1A1A1A"/>
-          <w:sz w:val="21"/>
-        </w:rPr>
-        <w:t>Zod</w:t>
-      </w:r>
-      <w:r>
-        <w:rPr>
-          <w:rFonts w:ascii="Calibri" w:hAnsi="Calibri" w:eastAsia="Calibri" w:cs="Calibri"/>
-          <w:b w:val="0"/>
-          <w:color w:val="1A1A1A"/>
-          <w:sz w:val="21"/>
-        </w:rPr>
-        <w:t>.</w:t>
       </w:r>
     </w:p>
     <w:p>
@@ -636,7 +1075,25 @@
           <w:color w:val="1A1A1A"/>
           <w:sz w:val="21"/>
         </w:rPr>
-        <w:t xml:space="preserve"> cache tags; revalidated through webhook triggered by content update events.</w:t>
+        <w:t xml:space="preserve"> cache tags; revalidated through </w:t>
+      </w:r>
+      <w:r>
+        <w:rPr>
+          <w:rFonts w:ascii="Calibri" w:hAnsi="Calibri" w:eastAsia="Calibri" w:cs="Calibri"/>
+          <w:b/>
+          <w:color w:val="1A1A1A"/>
+          <w:sz w:val="21"/>
+        </w:rPr>
+        <w:t>webhook</w:t>
+      </w:r>
+      <w:r>
+        <w:rPr>
+          <w:rFonts w:ascii="Calibri" w:hAnsi="Calibri" w:eastAsia="Calibri" w:cs="Calibri"/>
+          <w:b w:val="0"/>
+          <w:color w:val="1A1A1A"/>
+          <w:sz w:val="21"/>
+        </w:rPr>
+        <w:t xml:space="preserve"> triggered by content update events.</w:t>
       </w:r>
     </w:p>
     <w:p>
@@ -828,7 +1285,25 @@
           <w:color w:val="1A1A1A"/>
           <w:sz w:val="21"/>
         </w:rPr>
-        <w:t>Treated keyboard-accessible navigation, accessible form-error handling, semantic structure, and Lighthouse / axe checks as release requirements rather than post-launch fixes.</w:t>
+        <w:t xml:space="preserve">Static assets cached at </w:t>
+      </w:r>
+      <w:r>
+        <w:rPr>
+          <w:rFonts w:ascii="Calibri" w:hAnsi="Calibri" w:eastAsia="Calibri" w:cs="Calibri"/>
+          <w:b/>
+          <w:color w:val="1A1A1A"/>
+          <w:sz w:val="21"/>
+        </w:rPr>
+        <w:t>CloudFront</w:t>
+      </w:r>
+      <w:r>
+        <w:rPr>
+          <w:rFonts w:ascii="Calibri" w:hAnsi="Calibri" w:eastAsia="Calibri" w:cs="Calibri"/>
+          <w:b w:val="0"/>
+          <w:color w:val="1A1A1A"/>
+          <w:sz w:val="21"/>
+        </w:rPr>
+        <w:t xml:space="preserve"> to reduce latency and improve SEO.</w:t>
       </w:r>
     </w:p>
     <w:p>
@@ -844,7 +1319,77 @@
           <w:color w:val="1A1A1A"/>
           <w:sz w:val="21"/>
         </w:rPr>
-        <w:t>Built a Strapi plugin for AI content generation with AI SDK.</w:t>
+        <w:t xml:space="preserve">Improved </w:t>
+      </w:r>
+      <w:r>
+        <w:rPr>
+          <w:rFonts w:ascii="Calibri" w:hAnsi="Calibri" w:eastAsia="Calibri" w:cs="Calibri"/>
+          <w:b/>
+          <w:color w:val="1A1A1A"/>
+          <w:sz w:val="21"/>
+        </w:rPr>
+        <w:t>web accessibility</w:t>
+      </w:r>
+      <w:r>
+        <w:rPr>
+          <w:rFonts w:ascii="Calibri" w:hAnsi="Calibri" w:eastAsia="Calibri" w:cs="Calibri"/>
+          <w:b w:val="0"/>
+          <w:color w:val="1A1A1A"/>
+          <w:sz w:val="21"/>
+        </w:rPr>
+        <w:t xml:space="preserve"> with keyboard-accessible navigation, accessible form-error handling, semantic structure, and Lighthouse / axe checks as release requirements rather than post-launch fixes.</w:t>
+      </w:r>
+    </w:p>
+    <w:p>
+      <w:pPr>
+        <w:pStyle w:val="ListBullet"/>
+        <w:spacing w:before="0" w:after="30" w:line="240" w:lineRule="auto"/>
+        <w:ind w:left="288"/>
+      </w:pPr>
+      <w:r>
+        <w:rPr>
+          <w:rFonts w:ascii="Calibri" w:hAnsi="Calibri" w:eastAsia="Calibri" w:cs="Calibri"/>
+          <w:b w:val="0"/>
+          <w:color w:val="1A1A1A"/>
+          <w:sz w:val="21"/>
+        </w:rPr>
+        <w:t xml:space="preserve">Built a </w:t>
+      </w:r>
+      <w:r>
+        <w:rPr>
+          <w:rFonts w:ascii="Calibri" w:hAnsi="Calibri" w:eastAsia="Calibri" w:cs="Calibri"/>
+          <w:b/>
+          <w:color w:val="1A1A1A"/>
+          <w:sz w:val="21"/>
+        </w:rPr>
+        <w:t>Strapi plugin</w:t>
+      </w:r>
+      <w:r>
+        <w:rPr>
+          <w:rFonts w:ascii="Calibri" w:hAnsi="Calibri" w:eastAsia="Calibri" w:cs="Calibri"/>
+          <w:b w:val="0"/>
+          <w:color w:val="1A1A1A"/>
+          <w:sz w:val="21"/>
+        </w:rPr>
+        <w:t xml:space="preserve"> for AI content generation with </w:t>
+      </w:r>
+      <w:r>
+        <w:rPr>
+          <w:rFonts w:ascii="Calibri" w:hAnsi="Calibri" w:eastAsia="Calibri" w:cs="Calibri"/>
+          <w:b/>
+          <w:color w:val="1A1A1A"/>
+          <w:sz w:val="21"/>
+        </w:rPr>
+        <w:t>AI SDK</w:t>
+      </w:r>
+      <w:r>
+        <w:rPr>
+          <w:rFonts w:ascii="Calibri" w:hAnsi="Calibri" w:eastAsia="Calibri" w:cs="Calibri"/>
+          <w:b w:val="0"/>
+          <w:color w:val="1A1A1A"/>
+          <w:sz w:val="21"/>
+        </w:rPr>
+        <w:t>.</w:t>
       </w:r>
     </w:p>
     <w:p>
@@ -919,7 +1464,61 @@
           <w:color w:val="1A1A1A"/>
           <w:sz w:val="21"/>
         </w:rPr>
-        <w:t>Built the canvas with React Native Skia, React Native Reanimated, and gesture handlers; captured images with react-native-vision-camera.</w:t>
+        <w:t xml:space="preserve">Built the canvas with </w:t>
+      </w:r>
+      <w:r>
+        <w:rPr>
+          <w:rFonts w:ascii="Calibri" w:hAnsi="Calibri" w:eastAsia="Calibri" w:cs="Calibri"/>
+          <w:b/>
+          <w:color w:val="1A1A1A"/>
+          <w:sz w:val="21"/>
+        </w:rPr>
+        <w:t>React Native Skia</w:t>
+      </w:r>
+      <w:r>
+        <w:rPr>
+          <w:rFonts w:ascii="Calibri" w:hAnsi="Calibri" w:eastAsia="Calibri" w:cs="Calibri"/>
+          <w:b w:val="0"/>
+          <w:color w:val="1A1A1A"/>
+          <w:sz w:val="21"/>
+        </w:rPr>
+        <w:t xml:space="preserve">, </w:t>
+      </w:r>
+      <w:r>
+        <w:rPr>
+          <w:rFonts w:ascii="Calibri" w:hAnsi="Calibri" w:eastAsia="Calibri" w:cs="Calibri"/>
+          <w:b/>
+          <w:color w:val="1A1A1A"/>
+          <w:sz w:val="21"/>
+        </w:rPr>
+        <w:t>React Native Reanimated</w:t>
+      </w:r>
+      <w:r>
+        <w:rPr>
+          <w:rFonts w:ascii="Calibri" w:hAnsi="Calibri" w:eastAsia="Calibri" w:cs="Calibri"/>
+          <w:b w:val="0"/>
+          <w:color w:val="1A1A1A"/>
+          <w:sz w:val="21"/>
+        </w:rPr>
+        <w:t xml:space="preserve">, and gesture handlers; captured images with </w:t>
+      </w:r>
+      <w:r>
+        <w:rPr>
+          <w:rFonts w:ascii="Calibri" w:hAnsi="Calibri" w:eastAsia="Calibri" w:cs="Calibri"/>
+          <w:b/>
+          <w:color w:val="1A1A1A"/>
+          <w:sz w:val="21"/>
+        </w:rPr>
+        <w:t>react-native-vision-camera</w:t>
+      </w:r>
+      <w:r>
+        <w:rPr>
+          <w:rFonts w:ascii="Calibri" w:hAnsi="Calibri" w:eastAsia="Calibri" w:cs="Calibri"/>
+          <w:b w:val="0"/>
+          <w:color w:val="1A1A1A"/>
+          <w:sz w:val="21"/>
+        </w:rPr>
+        <w:t>.</w:t>
       </w:r>
     </w:p>
     <w:p>
@@ -935,7 +1534,25 @@
           <w:color w:val="1A1A1A"/>
           <w:sz w:val="21"/>
         </w:rPr>
-        <w:t>Converted SVG stickers into Skia SVG React components, enabling resize, rotate, pan, and scale on the canvas.</w:t>
+        <w:t xml:space="preserve">Converted SVG stickers into Skia SVG React components, enabling </w:t>
+      </w:r>
+      <w:r>
+        <w:rPr>
+          <w:rFonts w:ascii="Calibri" w:hAnsi="Calibri" w:eastAsia="Calibri" w:cs="Calibri"/>
+          <w:b/>
+          <w:color w:val="1A1A1A"/>
+          <w:sz w:val="21"/>
+        </w:rPr>
+        <w:t>resize, rotate, pan, and scale</w:t>
+      </w:r>
+      <w:r>
+        <w:rPr>
+          <w:rFonts w:ascii="Calibri" w:hAnsi="Calibri" w:eastAsia="Calibri" w:cs="Calibri"/>
+          <w:b w:val="0"/>
+          <w:color w:val="1A1A1A"/>
+          <w:sz w:val="21"/>
+        </w:rPr>
+        <w:t xml:space="preserve"> on the canvas.</w:t>
       </w:r>
     </w:p>
     <w:p>
@@ -985,7 +1602,25 @@
           <w:color w:val="1A1A1A"/>
           <w:sz w:val="21"/>
         </w:rPr>
-        <w:t xml:space="preserve">Optimized with memoization and context isolation; held </w:t>
+        <w:t xml:space="preserve">Optimized with </w:t>
+      </w:r>
+      <w:r>
+        <w:rPr>
+          <w:rFonts w:ascii="Calibri" w:hAnsi="Calibri" w:eastAsia="Calibri" w:cs="Calibri"/>
+          <w:b/>
+          <w:color w:val="1A1A1A"/>
+          <w:sz w:val="21"/>
+        </w:rPr>
+        <w:t>memoization</w:t>
+      </w:r>
+      <w:r>
+        <w:rPr>
+          <w:rFonts w:ascii="Calibri" w:hAnsi="Calibri" w:eastAsia="Calibri" w:cs="Calibri"/>
+          <w:b w:val="0"/>
+          <w:color w:val="1A1A1A"/>
+          <w:sz w:val="21"/>
+        </w:rPr>
+        <w:t xml:space="preserve"> and context isolation; held </w:t>
       </w:r>
       <w:r>
         <w:rPr>
@@ -1235,441 +1870,6 @@
           <w:sz w:val="21"/>
         </w:rPr>
         <w:t>Routed promo and milestone notifications to the matching screen via Firebase Cloud Messaging deep links.</w:t>
-      </w:r>
-    </w:p>
-    <w:p>
-      <w:pPr>
-        <w:spacing w:before="0" w:after="60" w:line="240" w:lineRule="auto"/>
-      </w:pPr>
-      <w:r>
-        <w:rPr>
-          <w:rFonts w:ascii="Calibri" w:hAnsi="Calibri" w:eastAsia="Calibri" w:cs="Calibri"/>
-          <w:b w:val="0"/>
-          <w:i w:val="0"/>
-          <w:color w:val="4A4A4A"/>
-          <w:sz w:val="20"/>
-        </w:rPr>
-        <w:t>Across client products:</w:t>
-      </w:r>
-    </w:p>
-    <w:p>
-      <w:pPr>
-        <w:pStyle w:val="ListBullet"/>
-        <w:spacing w:before="0" w:after="30" w:line="240" w:lineRule="auto"/>
-        <w:ind w:left="288"/>
-      </w:pPr>
-      <w:r>
-        <w:rPr>
-          <w:rFonts w:ascii="Calibri" w:hAnsi="Calibri" w:eastAsia="Calibri" w:cs="Calibri"/>
-          <w:b w:val="0"/>
-          <w:color w:val="1A1A1A"/>
-          <w:sz w:val="21"/>
-        </w:rPr>
-        <w:t xml:space="preserve">Built shared </w:t>
-      </w:r>
-      <w:r>
-        <w:rPr>
-          <w:rFonts w:ascii="Calibri" w:hAnsi="Calibri" w:eastAsia="Calibri" w:cs="Calibri"/>
-          <w:b/>
-          <w:color w:val="1A1A1A"/>
-          <w:sz w:val="21"/>
-        </w:rPr>
-        <w:t>design systems</w:t>
-      </w:r>
-      <w:r>
-        <w:rPr>
-          <w:rFonts w:ascii="Calibri" w:hAnsi="Calibri" w:eastAsia="Calibri" w:cs="Calibri"/>
-          <w:b w:val="0"/>
-          <w:color w:val="1A1A1A"/>
-          <w:sz w:val="21"/>
-        </w:rPr>
-        <w:t xml:space="preserve"> on </w:t>
-      </w:r>
-      <w:r>
-        <w:rPr>
-          <w:rFonts w:ascii="Calibri" w:hAnsi="Calibri" w:eastAsia="Calibri" w:cs="Calibri"/>
-          <w:b/>
-          <w:color w:val="1A1A1A"/>
-          <w:sz w:val="21"/>
-        </w:rPr>
-        <w:t>Radix</w:t>
-      </w:r>
-      <w:r>
-        <w:rPr>
-          <w:rFonts w:ascii="Calibri" w:hAnsi="Calibri" w:eastAsia="Calibri" w:cs="Calibri"/>
-          <w:b w:val="0"/>
-          <w:color w:val="1A1A1A"/>
-          <w:sz w:val="21"/>
-        </w:rPr>
-        <w:t xml:space="preserve"> / </w:t>
-      </w:r>
-      <w:r>
-        <w:rPr>
-          <w:rFonts w:ascii="Calibri" w:hAnsi="Calibri" w:eastAsia="Calibri" w:cs="Calibri"/>
-          <w:b/>
-          <w:color w:val="1A1A1A"/>
-          <w:sz w:val="21"/>
-        </w:rPr>
-        <w:t>Tailwind</w:t>
-      </w:r>
-      <w:r>
-        <w:rPr>
-          <w:rFonts w:ascii="Calibri" w:hAnsi="Calibri" w:eastAsia="Calibri" w:cs="Calibri"/>
-          <w:b w:val="0"/>
-          <w:color w:val="1A1A1A"/>
-          <w:sz w:val="21"/>
-        </w:rPr>
-        <w:t xml:space="preserve"> / </w:t>
-      </w:r>
-      <w:r>
-        <w:rPr>
-          <w:rFonts w:ascii="Calibri" w:hAnsi="Calibri" w:eastAsia="Calibri" w:cs="Calibri"/>
-          <w:b/>
-          <w:color w:val="1A1A1A"/>
-          <w:sz w:val="21"/>
-        </w:rPr>
-        <w:t>shadcn/ui</w:t>
-      </w:r>
-      <w:r>
-        <w:rPr>
-          <w:rFonts w:ascii="Calibri" w:hAnsi="Calibri" w:eastAsia="Calibri" w:cs="Calibri"/>
-          <w:b w:val="0"/>
-          <w:color w:val="1A1A1A"/>
-          <w:sz w:val="21"/>
-        </w:rPr>
-        <w:t xml:space="preserve">: themed with CSS </w:t>
-      </w:r>
-      <w:r>
-        <w:rPr>
-          <w:rFonts w:ascii="Calibri" w:hAnsi="Calibri" w:eastAsia="Calibri" w:cs="Calibri"/>
-          <w:b/>
-          <w:color w:val="1A1A1A"/>
-          <w:sz w:val="21"/>
-        </w:rPr>
-        <w:t>tokens</w:t>
-      </w:r>
-      <w:r>
-        <w:rPr>
-          <w:rFonts w:ascii="Calibri" w:hAnsi="Calibri" w:eastAsia="Calibri" w:cs="Calibri"/>
-          <w:b w:val="0"/>
-          <w:color w:val="1A1A1A"/>
-          <w:sz w:val="21"/>
-        </w:rPr>
-        <w:t xml:space="preserve"> (color, type, space) instead of per-app hex, and exposed typed, reusable component APIs via React composition — compound components, Slot / children, and shared hooks — rather than prop-heavy leaf components. </w:t>
-      </w:r>
-      <w:r>
-        <w:rPr>
-          <w:rFonts w:ascii="Calibri" w:hAnsi="Calibri" w:eastAsia="Calibri" w:cs="Calibri"/>
-          <w:b/>
-          <w:color w:val="1A1A1A"/>
-          <w:sz w:val="21"/>
-        </w:rPr>
-        <w:t>Storybook</w:t>
-      </w:r>
-      <w:r>
-        <w:rPr>
-          <w:rFonts w:ascii="Calibri" w:hAnsi="Calibri" w:eastAsia="Calibri" w:cs="Calibri"/>
-          <w:b w:val="0"/>
-          <w:color w:val="1A1A1A"/>
-          <w:sz w:val="21"/>
-        </w:rPr>
-        <w:t>, Fumadocs, and MDX documented the contract; adoption across client apps eliminated duplicate UI.</w:t>
-      </w:r>
-    </w:p>
-    <w:p>
-      <w:pPr>
-        <w:pStyle w:val="ListBullet"/>
-        <w:spacing w:before="0" w:after="30" w:line="240" w:lineRule="auto"/>
-        <w:ind w:left="288"/>
-      </w:pPr>
-      <w:r>
-        <w:rPr>
-          <w:rFonts w:ascii="Calibri" w:hAnsi="Calibri" w:eastAsia="Calibri" w:cs="Calibri"/>
-          <w:b w:val="0"/>
-          <w:color w:val="1A1A1A"/>
-          <w:sz w:val="21"/>
-        </w:rPr>
-        <w:t xml:space="preserve">Established </w:t>
-      </w:r>
-      <w:r>
-        <w:rPr>
-          <w:rFonts w:ascii="Calibri" w:hAnsi="Calibri" w:eastAsia="Calibri" w:cs="Calibri"/>
-          <w:b/>
-          <w:color w:val="1A1A1A"/>
-          <w:sz w:val="21"/>
-        </w:rPr>
-        <w:t>Vitest</w:t>
-      </w:r>
-      <w:r>
-        <w:rPr>
-          <w:rFonts w:ascii="Calibri" w:hAnsi="Calibri" w:eastAsia="Calibri" w:cs="Calibri"/>
-          <w:b w:val="0"/>
-          <w:color w:val="1A1A1A"/>
-          <w:sz w:val="21"/>
-        </w:rPr>
-        <w:t xml:space="preserve"> and </w:t>
-      </w:r>
-      <w:r>
-        <w:rPr>
-          <w:rFonts w:ascii="Calibri" w:hAnsi="Calibri" w:eastAsia="Calibri" w:cs="Calibri"/>
-          <w:b/>
-          <w:color w:val="1A1A1A"/>
-          <w:sz w:val="21"/>
-        </w:rPr>
-        <w:t>Playwright</w:t>
-      </w:r>
-      <w:r>
-        <w:rPr>
-          <w:rFonts w:ascii="Calibri" w:hAnsi="Calibri" w:eastAsia="Calibri" w:cs="Calibri"/>
-          <w:b w:val="0"/>
-          <w:color w:val="1A1A1A"/>
-          <w:sz w:val="21"/>
-        </w:rPr>
-        <w:t xml:space="preserve"> / </w:t>
-      </w:r>
-      <w:r>
-        <w:rPr>
-          <w:rFonts w:ascii="Calibri" w:hAnsi="Calibri" w:eastAsia="Calibri" w:cs="Calibri"/>
-          <w:b/>
-          <w:color w:val="1A1A1A"/>
-          <w:sz w:val="21"/>
-        </w:rPr>
-        <w:t>Cypress</w:t>
-      </w:r>
-      <w:r>
-        <w:rPr>
-          <w:rFonts w:ascii="Calibri" w:hAnsi="Calibri" w:eastAsia="Calibri" w:cs="Calibri"/>
-          <w:b w:val="0"/>
-          <w:color w:val="1A1A1A"/>
-          <w:sz w:val="21"/>
-        </w:rPr>
-        <w:t xml:space="preserve"> as quality gates for shared UI and the product flows using it.</w:t>
-      </w:r>
-    </w:p>
-    <w:p>
-      <w:pPr>
-        <w:pStyle w:val="ListBullet"/>
-        <w:spacing w:before="0" w:after="30" w:line="240" w:lineRule="auto"/>
-        <w:ind w:left="288"/>
-      </w:pPr>
-      <w:r>
-        <w:rPr>
-          <w:rFonts w:ascii="Calibri" w:hAnsi="Calibri" w:eastAsia="Calibri" w:cs="Calibri"/>
-          <w:b w:val="0"/>
-          <w:color w:val="1A1A1A"/>
-          <w:sz w:val="21"/>
-        </w:rPr>
-        <w:t xml:space="preserve">Instrumented client web and mobile apps and their APIs with </w:t>
-      </w:r>
-      <w:r>
-        <w:rPr>
-          <w:rFonts w:ascii="Calibri" w:hAnsi="Calibri" w:eastAsia="Calibri" w:cs="Calibri"/>
-          <w:b/>
-          <w:color w:val="1A1A1A"/>
-          <w:sz w:val="21"/>
-        </w:rPr>
-        <w:t>Sentry</w:t>
-      </w:r>
-      <w:r>
-        <w:rPr>
-          <w:rFonts w:ascii="Calibri" w:hAnsi="Calibri" w:eastAsia="Calibri" w:cs="Calibri"/>
-          <w:b w:val="0"/>
-          <w:color w:val="1A1A1A"/>
-          <w:sz w:val="21"/>
-        </w:rPr>
-        <w:t>, making production crashes, device issues, and API errors visible after release.</w:t>
-      </w:r>
-    </w:p>
-    <w:p>
-      <w:pPr>
-        <w:pStyle w:val="ListBullet"/>
-        <w:spacing w:before="0" w:after="30" w:line="240" w:lineRule="auto"/>
-        <w:ind w:left="288"/>
-      </w:pPr>
-      <w:r>
-        <w:rPr>
-          <w:rFonts w:ascii="Calibri" w:hAnsi="Calibri" w:eastAsia="Calibri" w:cs="Calibri"/>
-          <w:b w:val="0"/>
-          <w:color w:val="1A1A1A"/>
-          <w:sz w:val="21"/>
-        </w:rPr>
-        <w:t xml:space="preserve">Led adoption of </w:t>
-      </w:r>
-      <w:r>
-        <w:rPr>
-          <w:rFonts w:ascii="Calibri" w:hAnsi="Calibri" w:eastAsia="Calibri" w:cs="Calibri"/>
-          <w:b/>
-          <w:color w:val="1A1A1A"/>
-          <w:sz w:val="21"/>
-        </w:rPr>
-        <w:t>tRPC</w:t>
-      </w:r>
-      <w:r>
-        <w:rPr>
-          <w:rFonts w:ascii="Calibri" w:hAnsi="Calibri" w:eastAsia="Calibri" w:cs="Calibri"/>
-          <w:b w:val="0"/>
-          <w:color w:val="1A1A1A"/>
-          <w:sz w:val="21"/>
-        </w:rPr>
-        <w:t xml:space="preserve"> and Scalar-generated API documentation, cutting API integration time by </w:t>
-      </w:r>
-      <w:r>
-        <w:rPr>
-          <w:rFonts w:ascii="Calibri" w:hAnsi="Calibri" w:eastAsia="Calibri" w:cs="Calibri"/>
-          <w:b/>
-          <w:color w:val="1A1A1A"/>
-          <w:sz w:val="21"/>
-        </w:rPr>
-        <w:t>50%</w:t>
-      </w:r>
-      <w:r>
-        <w:rPr>
-          <w:rFonts w:ascii="Calibri" w:hAnsi="Calibri" w:eastAsia="Calibri" w:cs="Calibri"/>
-          <w:b w:val="0"/>
-          <w:color w:val="1A1A1A"/>
-          <w:sz w:val="21"/>
-        </w:rPr>
-        <w:t xml:space="preserve"> and eliminating schema-mismatch errors that blocked product work.</w:t>
-      </w:r>
-    </w:p>
-    <w:p>
-      <w:pPr>
-        <w:pStyle w:val="ListBullet"/>
-        <w:spacing w:before="0" w:after="30" w:line="240" w:lineRule="auto"/>
-        <w:ind w:left="288"/>
-      </w:pPr>
-      <w:r>
-        <w:rPr>
-          <w:rFonts w:ascii="Calibri" w:hAnsi="Calibri" w:eastAsia="Calibri" w:cs="Calibri"/>
-          <w:b w:val="0"/>
-          <w:color w:val="1A1A1A"/>
-          <w:sz w:val="21"/>
-        </w:rPr>
-        <w:t xml:space="preserve">Replaced WordPress across client sites with </w:t>
-      </w:r>
-      <w:r>
-        <w:rPr>
-          <w:rFonts w:ascii="Calibri" w:hAnsi="Calibri" w:eastAsia="Calibri" w:cs="Calibri"/>
-          <w:b/>
-          <w:color w:val="1A1A1A"/>
-          <w:sz w:val="21"/>
-        </w:rPr>
-        <w:t>headless CMS</w:t>
-      </w:r>
-      <w:r>
-        <w:rPr>
-          <w:rFonts w:ascii="Calibri" w:hAnsi="Calibri" w:eastAsia="Calibri" w:cs="Calibri"/>
-          <w:b w:val="0"/>
-          <w:color w:val="1A1A1A"/>
-          <w:sz w:val="21"/>
-        </w:rPr>
-        <w:t xml:space="preserve"> platforms (Strapi / Sanity) and </w:t>
-      </w:r>
-      <w:r>
-        <w:rPr>
-          <w:rFonts w:ascii="Calibri" w:hAnsi="Calibri" w:eastAsia="Calibri" w:cs="Calibri"/>
-          <w:b/>
-          <w:color w:val="1A1A1A"/>
-          <w:sz w:val="21"/>
-        </w:rPr>
-        <w:t>unified search</w:t>
-      </w:r>
-      <w:r>
-        <w:rPr>
-          <w:rFonts w:ascii="Calibri" w:hAnsi="Calibri" w:eastAsia="Calibri" w:cs="Calibri"/>
-          <w:b w:val="0"/>
-          <w:color w:val="1A1A1A"/>
-          <w:sz w:val="21"/>
-        </w:rPr>
-        <w:t xml:space="preserve"> (Meilisearch / Algolia) on </w:t>
-      </w:r>
-      <w:r>
-        <w:rPr>
-          <w:rFonts w:ascii="Calibri" w:hAnsi="Calibri" w:eastAsia="Calibri" w:cs="Calibri"/>
-          <w:b/>
-          <w:color w:val="1A1A1A"/>
-          <w:sz w:val="21"/>
-        </w:rPr>
-        <w:t>Next.js</w:t>
-      </w:r>
-      <w:r>
-        <w:rPr>
-          <w:rFonts w:ascii="Calibri" w:hAnsi="Calibri" w:eastAsia="Calibri" w:cs="Calibri"/>
-          <w:b w:val="0"/>
-          <w:color w:val="1A1A1A"/>
-          <w:sz w:val="21"/>
-        </w:rPr>
-        <w:t xml:space="preserve">; cut load times by </w:t>
-      </w:r>
-      <w:r>
-        <w:rPr>
-          <w:rFonts w:ascii="Calibri" w:hAnsi="Calibri" w:eastAsia="Calibri" w:cs="Calibri"/>
-          <w:b/>
-          <w:color w:val="1A1A1A"/>
-          <w:sz w:val="21"/>
-        </w:rPr>
-        <w:t>80%</w:t>
-      </w:r>
-      <w:r>
-        <w:rPr>
-          <w:rFonts w:ascii="Calibri" w:hAnsi="Calibri" w:eastAsia="Calibri" w:cs="Calibri"/>
-          <w:b w:val="0"/>
-          <w:color w:val="1A1A1A"/>
-          <w:sz w:val="21"/>
-        </w:rPr>
-        <w:t xml:space="preserve"> and search latency by </w:t>
-      </w:r>
-      <w:r>
-        <w:rPr>
-          <w:rFonts w:ascii="Calibri" w:hAnsi="Calibri" w:eastAsia="Calibri" w:cs="Calibri"/>
-          <w:b/>
-          <w:color w:val="1A1A1A"/>
-          <w:sz w:val="21"/>
-        </w:rPr>
-        <w:t>90%</w:t>
-      </w:r>
-      <w:r>
-        <w:rPr>
-          <w:rFonts w:ascii="Calibri" w:hAnsi="Calibri" w:eastAsia="Calibri" w:cs="Calibri"/>
-          <w:b w:val="0"/>
-          <w:color w:val="1A1A1A"/>
-          <w:sz w:val="21"/>
-        </w:rPr>
-        <w:t xml:space="preserve">, and achieved PageSpeed Insights scores above </w:t>
-      </w:r>
-      <w:r>
-        <w:rPr>
-          <w:rFonts w:ascii="Calibri" w:hAnsi="Calibri" w:eastAsia="Calibri" w:cs="Calibri"/>
-          <w:b/>
-          <w:color w:val="1A1A1A"/>
-          <w:sz w:val="21"/>
-        </w:rPr>
-        <w:t>95</w:t>
-      </w:r>
-      <w:r>
-        <w:rPr>
-          <w:rFonts w:ascii="Calibri" w:hAnsi="Calibri" w:eastAsia="Calibri" w:cs="Calibri"/>
-          <w:b w:val="0"/>
-          <w:color w:val="1A1A1A"/>
-          <w:sz w:val="21"/>
-        </w:rPr>
-        <w:t>.</w:t>
-      </w:r>
-    </w:p>
-    <w:p>
-      <w:pPr>
-        <w:pStyle w:val="ListBullet"/>
-        <w:spacing w:before="0" w:after="30" w:line="240" w:lineRule="auto"/>
-        <w:ind w:left="288"/>
-      </w:pPr>
-      <w:r>
-        <w:rPr>
-          <w:rFonts w:ascii="Calibri" w:hAnsi="Calibri" w:eastAsia="Calibri" w:cs="Calibri"/>
-          <w:b w:val="0"/>
-          <w:color w:val="1A1A1A"/>
-          <w:sz w:val="21"/>
-        </w:rPr>
-        <w:t>Mentored summer interns and junior developers through pair programming, code reviews, and guidance as they shipped production UI.</w:t>
       </w:r>
     </w:p>
     <w:p>

</xml_diff>